<commit_message>
docs: les 3 formats de formulaire technique (je le mets ici juste pour ne pas le stocker dans mon ordi :) )
</commit_message>
<xml_diff>
--- a/Formulaire technique 2026.docx
+++ b/Formulaire technique 2026.docx
@@ -4,7 +4,7 @@
   <w:body>
     <w:p>
       <w:pPr>
-        <w:pStyle w:val="Titre"/>
+        <w:pStyle w:val="Title"/>
         <w:spacing w:after="0"/>
         <w:rPr>
           <w:rFonts w:eastAsia="Times New Roman"/>
@@ -30,6 +30,12 @@
           <w:lang w:eastAsia="fr-FR"/>
         </w:rPr>
         <w:t>Nom de l’application :</w:t>
+      </w:r>
+      <w:r>
+        <w:rPr>
+          <w:lang w:eastAsia="fr-FR"/>
+        </w:rPr>
+        <w:t xml:space="preserve"> Glouton Budget</w:t>
       </w:r>
     </w:p>
     <w:p>
@@ -48,7 +54,31 @@
         <w:rPr>
           <w:lang w:eastAsia="fr-FR"/>
         </w:rPr>
-        <w:t xml:space="preserve"> [abc1234a] / [def5678b]</w:t>
+        <w:t xml:space="preserve"> [</w:t>
+      </w:r>
+      <w:r>
+        <w:rPr>
+          <w:lang w:eastAsia="fr-FR"/>
+        </w:rPr>
+        <w:t>shn4606a</w:t>
+      </w:r>
+      <w:r>
+        <w:rPr>
+          <w:lang w:eastAsia="fr-FR"/>
+        </w:rPr>
+        <w:t>] / [</w:t>
+      </w:r>
+      <w:r>
+        <w:rPr>
+          <w:lang w:eastAsia="fr-FR"/>
+        </w:rPr>
+        <w:t>rcl4463a</w:t>
+      </w:r>
+      <w:r>
+        <w:rPr>
+          <w:lang w:eastAsia="fr-FR"/>
+        </w:rPr>
+        <w:t>]</w:t>
       </w:r>
     </w:p>
     <w:p>
@@ -133,7 +163,7 @@
     </w:p>
     <w:p>
       <w:pPr>
-        <w:pStyle w:val="Titre1"/>
+        <w:pStyle w:val="Heading1"/>
         <w:spacing w:before="0" w:after="0"/>
         <w:rPr>
           <w:rFonts w:eastAsia="Times New Roman"/>
@@ -150,7 +180,7 @@
     </w:p>
     <w:p>
       <w:pPr>
-        <w:pStyle w:val="Titre2"/>
+        <w:pStyle w:val="Heading2"/>
         <w:spacing w:before="0" w:after="0"/>
         <w:rPr>
           <w:rFonts w:eastAsia="Times New Roman"/>
@@ -182,7 +212,7 @@
         <w:rPr>
           <w:lang w:eastAsia="fr-FR"/>
         </w:rPr>
-        <w:t>Décrivez en quelques lignes l’objectif de votre application et le besoin auquel elle répond.</w:t>
+        <w:t>Application mobile permettant aux étudiants de suivre leurs dépenses quotidiennes, notamment les repas CROUS, afin de mieux gérer leur budget de manière simple et rapide.</w:t>
       </w:r>
     </w:p>
     <w:p>
@@ -197,7 +227,7 @@
     </w:p>
     <w:p>
       <w:pPr>
-        <w:pStyle w:val="Titre2"/>
+        <w:pStyle w:val="Heading2"/>
         <w:spacing w:before="0" w:after="0"/>
         <w:rPr>
           <w:rFonts w:eastAsia="Times New Roman"/>
@@ -221,6 +251,11 @@
     </w:p>
     <w:p>
       <w:pPr>
+        <w:pStyle w:val="ListParagraph"/>
+        <w:numPr>
+          <w:ilvl w:val="0"/>
+          <w:numId w:val="12"/>
+        </w:numPr>
         <w:rPr>
           <w:lang w:eastAsia="fr-FR"/>
         </w:rPr>
@@ -229,19 +264,110 @@
         <w:rPr>
           <w:lang w:eastAsia="fr-FR"/>
         </w:rPr>
-        <w:t>Décrivez brièvement les principales fonctionnalités proposées à l’utilisateur.</w:t>
+        <w:t>Ajout rapide de repas (boursier ou non boursier)</w:t>
       </w:r>
     </w:p>
     <w:p>
       <w:pPr>
-        <w:rPr>
-          <w:lang w:eastAsia="fr-FR"/>
-        </w:rPr>
-      </w:pPr>
-    </w:p>
-    <w:p>
-      <w:pPr>
-        <w:pStyle w:val="Titre1"/>
+        <w:pStyle w:val="ListParagraph"/>
+        <w:numPr>
+          <w:ilvl w:val="0"/>
+          <w:numId w:val="12"/>
+        </w:numPr>
+        <w:rPr>
+          <w:lang w:eastAsia="fr-FR"/>
+        </w:rPr>
+      </w:pPr>
+      <w:r>
+        <w:rPr>
+          <w:lang w:eastAsia="fr-FR"/>
+        </w:rPr>
+        <w:t>Ajout de dépenses personnalisées</w:t>
+      </w:r>
+    </w:p>
+    <w:p>
+      <w:pPr>
+        <w:pStyle w:val="ListParagraph"/>
+        <w:numPr>
+          <w:ilvl w:val="0"/>
+          <w:numId w:val="12"/>
+        </w:numPr>
+        <w:rPr>
+          <w:lang w:eastAsia="fr-FR"/>
+        </w:rPr>
+      </w:pPr>
+      <w:r>
+        <w:rPr>
+          <w:lang w:eastAsia="fr-FR"/>
+        </w:rPr>
+        <w:t>Affichage du total des dépenses</w:t>
+      </w:r>
+    </w:p>
+    <w:p>
+      <w:pPr>
+        <w:pStyle w:val="ListParagraph"/>
+        <w:numPr>
+          <w:ilvl w:val="0"/>
+          <w:numId w:val="12"/>
+        </w:numPr>
+        <w:rPr>
+          <w:lang w:eastAsia="fr-FR"/>
+        </w:rPr>
+      </w:pPr>
+      <w:r>
+        <w:rPr>
+          <w:lang w:eastAsia="fr-FR"/>
+        </w:rPr>
+        <w:t>Consultation de l’historique</w:t>
+      </w:r>
+    </w:p>
+    <w:p>
+      <w:pPr>
+        <w:pStyle w:val="ListParagraph"/>
+        <w:numPr>
+          <w:ilvl w:val="0"/>
+          <w:numId w:val="12"/>
+        </w:numPr>
+        <w:rPr>
+          <w:lang w:eastAsia="fr-FR"/>
+        </w:rPr>
+      </w:pPr>
+      <w:r>
+        <w:rPr>
+          <w:lang w:eastAsia="fr-FR"/>
+        </w:rPr>
+        <w:t>Suppression de dépenses (glissement)</w:t>
+      </w:r>
+    </w:p>
+    <w:p>
+      <w:pPr>
+        <w:pStyle w:val="ListParagraph"/>
+        <w:numPr>
+          <w:ilvl w:val="0"/>
+          <w:numId w:val="12"/>
+        </w:numPr>
+        <w:rPr>
+          <w:lang w:eastAsia="fr-FR"/>
+        </w:rPr>
+      </w:pPr>
+      <w:r>
+        <w:rPr>
+          <w:lang w:eastAsia="fr-FR"/>
+        </w:rPr>
+        <w:t>Gestion des préférences (thème, statut boursier)</w:t>
+      </w:r>
+    </w:p>
+    <w:p>
+      <w:pPr>
+        <w:ind w:left="720"/>
+        <w:rPr>
+          <w:lang w:eastAsia="fr-FR"/>
+        </w:rPr>
+      </w:pPr>
+    </w:p>
+    <w:p>
+      <w:pPr>
+        <w:pStyle w:val="Heading1"/>
         <w:spacing w:before="0" w:after="0"/>
         <w:rPr>
           <w:rFonts w:eastAsia="Times New Roman"/>
@@ -261,7 +387,7 @@
     </w:p>
     <w:p>
       <w:pPr>
-        <w:pStyle w:val="Titre2"/>
+        <w:pStyle w:val="Heading2"/>
         <w:spacing w:before="0" w:after="0"/>
         <w:rPr>
           <w:rFonts w:eastAsia="Times New Roman"/>
@@ -311,7 +437,7 @@
     </w:p>
     <w:tbl>
       <w:tblPr>
-        <w:tblStyle w:val="Grilledutableau"/>
+        <w:tblStyle w:val="TableGrid"/>
         <w:tblW w:w="9209" w:type="dxa"/>
         <w:jc w:val="center"/>
         <w:tblLook w:val="04A0" w:firstRow="1" w:lastRow="0" w:firstColumn="1" w:lastColumn="0" w:noHBand="0" w:noVBand="1"/>
@@ -389,23 +515,36 @@
           </w:tcPr>
           <w:p>
             <w:pPr>
-              <w:rPr>
-                <w:lang w:eastAsia="fr-FR"/>
-              </w:rPr>
-            </w:pPr>
+              <w:jc w:val="center"/>
+              <w:rPr>
+                <w:lang w:eastAsia="fr-FR"/>
+              </w:rPr>
+            </w:pPr>
+            <w:r>
+              <w:rPr>
+                <w:lang w:eastAsia="fr-FR"/>
+              </w:rPr>
+              <w:t>Ecran 1</w:t>
+            </w:r>
+            <w:r>
+              <w:rPr>
+                <w:lang w:eastAsia="fr-FR"/>
+              </w:rPr>
+              <w:t>(</w:t>
+            </w:r>
             <w:proofErr w:type="spellStart"/>
             <w:r>
               <w:rPr>
                 <w:lang w:eastAsia="fr-FR"/>
               </w:rPr>
-              <w:t>Ecran</w:t>
+              <w:t>HomeScreen</w:t>
             </w:r>
             <w:proofErr w:type="spellEnd"/>
             <w:r>
               <w:rPr>
                 <w:lang w:eastAsia="fr-FR"/>
               </w:rPr>
-              <w:t xml:space="preserve"> 1</w:t>
+              <w:t>)</w:t>
             </w:r>
           </w:p>
         </w:tc>
@@ -416,17 +555,17 @@
           </w:tcPr>
           <w:p>
             <w:pPr>
-              <w:rPr>
-                <w:lang w:eastAsia="fr-FR"/>
-              </w:rPr>
-            </w:pPr>
-          </w:p>
-          <w:p>
-            <w:pPr>
-              <w:rPr>
-                <w:lang w:eastAsia="fr-FR"/>
-              </w:rPr>
-            </w:pPr>
+              <w:jc w:val="center"/>
+              <w:rPr>
+                <w:lang w:eastAsia="fr-FR"/>
+              </w:rPr>
+            </w:pPr>
+            <w:r>
+              <w:rPr>
+                <w:lang w:eastAsia="fr-FR"/>
+              </w:rPr>
+              <w:t>Affiche le total des dépenses et permet l’ajout rapide</w:t>
+            </w:r>
           </w:p>
         </w:tc>
       </w:tr>
@@ -441,23 +580,36 @@
           </w:tcPr>
           <w:p>
             <w:pPr>
-              <w:rPr>
-                <w:lang w:eastAsia="fr-FR"/>
-              </w:rPr>
-            </w:pPr>
+              <w:jc w:val="center"/>
+              <w:rPr>
+                <w:lang w:eastAsia="fr-FR"/>
+              </w:rPr>
+            </w:pPr>
+            <w:r>
+              <w:rPr>
+                <w:lang w:eastAsia="fr-FR"/>
+              </w:rPr>
+              <w:t>Ecran 2</w:t>
+            </w:r>
+            <w:r>
+              <w:rPr>
+                <w:lang w:eastAsia="fr-FR"/>
+              </w:rPr>
+              <w:t>(</w:t>
+            </w:r>
             <w:proofErr w:type="spellStart"/>
             <w:r>
               <w:rPr>
                 <w:lang w:eastAsia="fr-FR"/>
               </w:rPr>
-              <w:t>Ecran</w:t>
+              <w:t>AjouterDepense</w:t>
             </w:r>
             <w:proofErr w:type="spellEnd"/>
             <w:r>
               <w:rPr>
                 <w:lang w:eastAsia="fr-FR"/>
               </w:rPr>
-              <w:t xml:space="preserve"> 2</w:t>
+              <w:t>)</w:t>
             </w:r>
           </w:p>
         </w:tc>
@@ -469,24 +621,25 @@
           </w:tcPr>
           <w:p>
             <w:pPr>
-              <w:rPr>
-                <w:lang w:eastAsia="fr-FR"/>
-              </w:rPr>
-            </w:pPr>
-          </w:p>
-          <w:p>
-            <w:pPr>
-              <w:rPr>
-                <w:lang w:eastAsia="fr-FR"/>
-              </w:rPr>
-            </w:pPr>
-          </w:p>
-          <w:p>
-            <w:pPr>
-              <w:rPr>
-                <w:lang w:eastAsia="fr-FR"/>
-              </w:rPr>
-            </w:pPr>
+              <w:jc w:val="center"/>
+              <w:rPr>
+                <w:lang w:eastAsia="fr-FR"/>
+              </w:rPr>
+            </w:pPr>
+          </w:p>
+          <w:p>
+            <w:pPr>
+              <w:jc w:val="center"/>
+              <w:rPr>
+                <w:lang w:eastAsia="fr-FR"/>
+              </w:rPr>
+            </w:pPr>
+            <w:r>
+              <w:rPr>
+                <w:lang w:eastAsia="fr-FR"/>
+              </w:rPr>
+              <w:t>Formulaire pour ajouter une dépense</w:t>
+            </w:r>
           </w:p>
         </w:tc>
       </w:tr>
@@ -501,23 +654,34 @@
           </w:tcPr>
           <w:p>
             <w:pPr>
-              <w:rPr>
-                <w:lang w:eastAsia="fr-FR"/>
-              </w:rPr>
-            </w:pPr>
-            <w:proofErr w:type="spellStart"/>
-            <w:r>
-              <w:rPr>
-                <w:lang w:eastAsia="fr-FR"/>
-              </w:rPr>
-              <w:t>Ecran</w:t>
-            </w:r>
-            <w:proofErr w:type="spellEnd"/>
-            <w:r>
-              <w:rPr>
-                <w:lang w:eastAsia="fr-FR"/>
-              </w:rPr>
-              <w:t xml:space="preserve"> 3</w:t>
+              <w:jc w:val="center"/>
+              <w:rPr>
+                <w:lang w:eastAsia="fr-FR"/>
+              </w:rPr>
+            </w:pPr>
+            <w:r>
+              <w:rPr>
+                <w:lang w:eastAsia="fr-FR"/>
+              </w:rPr>
+              <w:t>Ecran 3</w:t>
+            </w:r>
+            <w:r>
+              <w:rPr>
+                <w:lang w:eastAsia="fr-FR"/>
+              </w:rPr>
+              <w:t>(</w:t>
+            </w:r>
+            <w:r>
+              <w:rPr>
+                <w:lang w:eastAsia="fr-FR"/>
+              </w:rPr>
+              <w:t>Historique</w:t>
+            </w:r>
+            <w:r>
+              <w:rPr>
+                <w:lang w:eastAsia="fr-FR"/>
+              </w:rPr>
+              <w:t>)</w:t>
             </w:r>
           </w:p>
         </w:tc>
@@ -529,24 +693,25 @@
           </w:tcPr>
           <w:p>
             <w:pPr>
-              <w:rPr>
-                <w:lang w:eastAsia="fr-FR"/>
-              </w:rPr>
-            </w:pPr>
-          </w:p>
-          <w:p>
-            <w:pPr>
-              <w:rPr>
-                <w:lang w:eastAsia="fr-FR"/>
-              </w:rPr>
-            </w:pPr>
-          </w:p>
-          <w:p>
-            <w:pPr>
-              <w:rPr>
-                <w:lang w:eastAsia="fr-FR"/>
-              </w:rPr>
-            </w:pPr>
+              <w:jc w:val="center"/>
+              <w:rPr>
+                <w:lang w:eastAsia="fr-FR"/>
+              </w:rPr>
+            </w:pPr>
+          </w:p>
+          <w:p>
+            <w:pPr>
+              <w:jc w:val="center"/>
+              <w:rPr>
+                <w:lang w:eastAsia="fr-FR"/>
+              </w:rPr>
+            </w:pPr>
+            <w:r>
+              <w:rPr>
+                <w:lang w:eastAsia="fr-FR"/>
+              </w:rPr>
+              <w:t>Liste des dépenses avec suppression</w:t>
+            </w:r>
           </w:p>
         </w:tc>
       </w:tr>
@@ -561,23 +726,36 @@
           </w:tcPr>
           <w:p>
             <w:pPr>
-              <w:rPr>
-                <w:lang w:eastAsia="fr-FR"/>
-              </w:rPr>
-            </w:pPr>
+              <w:jc w:val="center"/>
+              <w:rPr>
+                <w:lang w:eastAsia="fr-FR"/>
+              </w:rPr>
+            </w:pPr>
+            <w:r>
+              <w:rPr>
+                <w:lang w:eastAsia="fr-FR"/>
+              </w:rPr>
+              <w:t>Ecran 4</w:t>
+            </w:r>
+            <w:r>
+              <w:rPr>
+                <w:lang w:eastAsia="fr-FR"/>
+              </w:rPr>
+              <w:t>(</w:t>
+            </w:r>
             <w:proofErr w:type="spellStart"/>
             <w:r>
               <w:rPr>
                 <w:lang w:eastAsia="fr-FR"/>
               </w:rPr>
-              <w:t>Ecran</w:t>
+              <w:t>Parametres</w:t>
             </w:r>
             <w:proofErr w:type="spellEnd"/>
             <w:r>
               <w:rPr>
                 <w:lang w:eastAsia="fr-FR"/>
               </w:rPr>
-              <w:t xml:space="preserve"> 4</w:t>
+              <w:t>)</w:t>
             </w:r>
           </w:p>
         </w:tc>
@@ -589,20 +767,29 @@
           </w:tcPr>
           <w:p>
             <w:pPr>
-              <w:rPr>
-                <w:lang w:eastAsia="fr-FR"/>
-              </w:rPr>
-            </w:pPr>
-          </w:p>
-          <w:p>
-            <w:pPr>
-              <w:rPr>
-                <w:lang w:eastAsia="fr-FR"/>
-              </w:rPr>
-            </w:pPr>
-          </w:p>
-          <w:p>
-            <w:pPr>
+              <w:jc w:val="center"/>
+              <w:rPr>
+                <w:lang w:eastAsia="fr-FR"/>
+              </w:rPr>
+            </w:pPr>
+            <w:r>
+              <w:rPr>
+                <w:lang w:eastAsia="fr-FR"/>
+              </w:rPr>
+              <w:t>Gestion du thème et du statut boursier</w:t>
+            </w:r>
+          </w:p>
+          <w:p>
+            <w:pPr>
+              <w:jc w:val="center"/>
+              <w:rPr>
+                <w:lang w:eastAsia="fr-FR"/>
+              </w:rPr>
+            </w:pPr>
+          </w:p>
+          <w:p>
+            <w:pPr>
+              <w:jc w:val="center"/>
               <w:rPr>
                 <w:lang w:eastAsia="fr-FR"/>
               </w:rPr>
@@ -621,39 +808,26 @@
           </w:tcPr>
           <w:p>
             <w:pPr>
-              <w:rPr>
-                <w:lang w:eastAsia="fr-FR"/>
-              </w:rPr>
-            </w:pPr>
-            <w:proofErr w:type="spellStart"/>
-            <w:r>
-              <w:rPr>
-                <w:lang w:eastAsia="fr-FR"/>
-              </w:rPr>
-              <w:t>Ecrans</w:t>
-            </w:r>
-            <w:proofErr w:type="spellEnd"/>
-            <w:r>
-              <w:rPr>
-                <w:lang w:eastAsia="fr-FR"/>
-              </w:rPr>
-              <w:t xml:space="preserve"> supplémentaires</w:t>
+              <w:jc w:val="center"/>
+              <w:rPr>
+                <w:lang w:eastAsia="fr-FR"/>
+              </w:rPr>
+            </w:pPr>
+            <w:r>
+              <w:rPr>
+                <w:lang w:eastAsia="fr-FR"/>
+              </w:rPr>
+              <w:t>Ecrans supplémentaires</w:t>
             </w:r>
           </w:p>
         </w:tc>
         <w:tc>
           <w:tcPr>
             <w:tcW w:w="5103" w:type="dxa"/>
-            <w:vAlign w:val="center"/>
-            <w:hideMark/>
-          </w:tcPr>
-          <w:p>
-            <w:pPr>
-              <w:rPr>
-                <w:lang w:eastAsia="fr-FR"/>
-              </w:rPr>
-            </w:pPr>
-          </w:p>
+            <w:shd w:val="clear" w:color="auto" w:fill="ADADAD" w:themeFill="background2" w:themeFillShade="BF"/>
+            <w:vAlign w:val="center"/>
+            <w:hideMark/>
+          </w:tcPr>
           <w:p>
             <w:pPr>
               <w:rPr>
@@ -687,7 +861,7 @@
     </w:p>
     <w:p>
       <w:pPr>
-        <w:pStyle w:val="Titre1"/>
+        <w:pStyle w:val="Heading1"/>
         <w:spacing w:before="0" w:after="0"/>
         <w:rPr>
           <w:rFonts w:eastAsia="Times New Roman"/>
@@ -699,6 +873,7 @@
           <w:rFonts w:eastAsia="Times New Roman"/>
           <w:lang w:eastAsia="fr-FR"/>
         </w:rPr>
+        <w:lastRenderedPageBreak/>
         <w:t>Navigation entre écrans</w:t>
       </w:r>
     </w:p>
@@ -794,7 +969,7 @@
     </w:p>
     <w:tbl>
       <w:tblPr>
-        <w:tblStyle w:val="Grilledutableau"/>
+        <w:tblStyle w:val="TableGrid"/>
         <w:tblW w:w="9351" w:type="dxa"/>
         <w:tblLook w:val="04A0" w:firstRow="1" w:lastRow="0" w:firstColumn="1" w:lastColumn="0" w:noHBand="0" w:noVBand="1"/>
       </w:tblPr>
@@ -824,7 +999,6 @@
                 <w:bCs/>
                 <w:lang w:eastAsia="fr-FR"/>
               </w:rPr>
-              <w:lastRenderedPageBreak/>
               <w:t>Élément</w:t>
             </w:r>
           </w:p>
@@ -884,20 +1058,23 @@
           </w:tcPr>
           <w:p>
             <w:pPr>
-              <w:rPr>
-                <w:lang w:eastAsia="fr-FR"/>
-              </w:rPr>
-            </w:pPr>
-          </w:p>
-          <w:p>
-            <w:pPr>
-              <w:rPr>
-                <w:lang w:eastAsia="fr-FR"/>
-              </w:rPr>
-            </w:pPr>
-          </w:p>
-          <w:p>
-            <w:pPr>
+              <w:jc w:val="center"/>
+              <w:rPr>
+                <w:lang w:eastAsia="fr-FR"/>
+              </w:rPr>
+            </w:pPr>
+            <w:proofErr w:type="spellStart"/>
+            <w:r>
+              <w:rPr>
+                <w:lang w:eastAsia="fr-FR"/>
+              </w:rPr>
+              <w:t>HomeScreen</w:t>
+            </w:r>
+            <w:proofErr w:type="spellEnd"/>
+          </w:p>
+          <w:p>
+            <w:pPr>
+              <w:jc w:val="center"/>
               <w:rPr>
                 <w:lang w:eastAsia="fr-FR"/>
               </w:rPr>
@@ -934,20 +1111,23 @@
           </w:tcPr>
           <w:p>
             <w:pPr>
-              <w:rPr>
-                <w:lang w:eastAsia="fr-FR"/>
-              </w:rPr>
-            </w:pPr>
-          </w:p>
-          <w:p>
-            <w:pPr>
-              <w:rPr>
-                <w:lang w:eastAsia="fr-FR"/>
-              </w:rPr>
-            </w:pPr>
-          </w:p>
-          <w:p>
-            <w:pPr>
+              <w:jc w:val="center"/>
+              <w:rPr>
+                <w:lang w:eastAsia="fr-FR"/>
+              </w:rPr>
+            </w:pPr>
+            <w:proofErr w:type="spellStart"/>
+            <w:r>
+              <w:rPr>
+                <w:lang w:eastAsia="fr-FR"/>
+              </w:rPr>
+              <w:t>Parametres</w:t>
+            </w:r>
+            <w:proofErr w:type="spellEnd"/>
+          </w:p>
+          <w:p>
+            <w:pPr>
+              <w:jc w:val="center"/>
               <w:rPr>
                 <w:lang w:eastAsia="fr-FR"/>
               </w:rPr>
@@ -984,20 +1164,21 @@
           </w:tcPr>
           <w:p>
             <w:pPr>
-              <w:rPr>
-                <w:lang w:eastAsia="fr-FR"/>
-              </w:rPr>
-            </w:pPr>
-          </w:p>
-          <w:p>
-            <w:pPr>
-              <w:rPr>
-                <w:lang w:eastAsia="fr-FR"/>
-              </w:rPr>
-            </w:pPr>
-          </w:p>
-          <w:p>
-            <w:pPr>
+              <w:jc w:val="center"/>
+              <w:rPr>
+                <w:lang w:eastAsia="fr-FR"/>
+              </w:rPr>
+            </w:pPr>
+            <w:r>
+              <w:rPr>
+                <w:lang w:eastAsia="fr-FR"/>
+              </w:rPr>
+              <w:t>Statut boursier</w:t>
+            </w:r>
+          </w:p>
+          <w:p>
+            <w:pPr>
+              <w:jc w:val="center"/>
               <w:rPr>
                 <w:lang w:eastAsia="fr-FR"/>
               </w:rPr>
@@ -1034,20 +1215,21 @@
           </w:tcPr>
           <w:p>
             <w:pPr>
-              <w:rPr>
-                <w:lang w:eastAsia="fr-FR"/>
-              </w:rPr>
-            </w:pPr>
-          </w:p>
-          <w:p>
-            <w:pPr>
-              <w:rPr>
-                <w:lang w:eastAsia="fr-FR"/>
-              </w:rPr>
-            </w:pPr>
-          </w:p>
-          <w:p>
-            <w:pPr>
+              <w:jc w:val="center"/>
+              <w:rPr>
+                <w:lang w:eastAsia="fr-FR"/>
+              </w:rPr>
+            </w:pPr>
+            <w:r>
+              <w:rPr>
+                <w:lang w:eastAsia="fr-FR"/>
+              </w:rPr>
+              <w:t>Valeur modifiée du statut boursier</w:t>
+            </w:r>
+          </w:p>
+          <w:p>
+            <w:pPr>
+              <w:jc w:val="center"/>
               <w:rPr>
                 <w:lang w:eastAsia="fr-FR"/>
               </w:rPr>
@@ -1084,20 +1266,25 @@
           </w:tcPr>
           <w:p>
             <w:pPr>
-              <w:rPr>
-                <w:lang w:eastAsia="fr-FR"/>
-              </w:rPr>
-            </w:pPr>
-          </w:p>
-          <w:p>
-            <w:pPr>
-              <w:rPr>
-                <w:lang w:eastAsia="fr-FR"/>
-              </w:rPr>
-            </w:pPr>
-          </w:p>
-          <w:p>
-            <w:pPr>
+              <w:jc w:val="center"/>
+              <w:rPr>
+                <w:lang w:eastAsia="fr-FR"/>
+              </w:rPr>
+            </w:pPr>
+            <w:proofErr w:type="spellStart"/>
+            <w:proofErr w:type="gramStart"/>
+            <w:r>
+              <w:rPr>
+                <w:lang w:eastAsia="fr-FR"/>
+              </w:rPr>
+              <w:t>main.dart</w:t>
+            </w:r>
+            <w:proofErr w:type="spellEnd"/>
+            <w:proofErr w:type="gramEnd"/>
+          </w:p>
+          <w:p>
+            <w:pPr>
+              <w:jc w:val="center"/>
               <w:rPr>
                 <w:lang w:eastAsia="fr-FR"/>
               </w:rPr>
@@ -1122,7 +1309,7 @@
     </w:p>
     <w:p>
       <w:pPr>
-        <w:pStyle w:val="Titre1"/>
+        <w:pStyle w:val="Heading1"/>
         <w:spacing w:before="0" w:after="0"/>
         <w:rPr>
           <w:rFonts w:eastAsia="Times New Roman"/>
@@ -1166,7 +1353,7 @@
     </w:p>
     <w:tbl>
       <w:tblPr>
-        <w:tblStyle w:val="Grilledutableau"/>
+        <w:tblStyle w:val="TableGrid"/>
         <w:tblW w:w="9351" w:type="dxa"/>
         <w:tblLook w:val="04A0" w:firstRow="1" w:lastRow="0" w:firstColumn="1" w:lastColumn="0" w:noHBand="0" w:noVBand="1"/>
       </w:tblPr>
@@ -1255,10 +1442,19 @@
           </w:tcPr>
           <w:p>
             <w:pPr>
-              <w:rPr>
-                <w:lang w:eastAsia="fr-FR"/>
-              </w:rPr>
-            </w:pPr>
+              <w:jc w:val="center"/>
+              <w:rPr>
+                <w:lang w:eastAsia="fr-FR"/>
+              </w:rPr>
+            </w:pPr>
+            <w:proofErr w:type="spellStart"/>
+            <w:r>
+              <w:rPr>
+                <w:lang w:eastAsia="fr-FR"/>
+              </w:rPr>
+              <w:t>HomeScreen</w:t>
+            </w:r>
+            <w:proofErr w:type="spellEnd"/>
           </w:p>
         </w:tc>
       </w:tr>
@@ -1291,10 +1487,45 @@
           </w:tcPr>
           <w:p>
             <w:pPr>
-              <w:rPr>
-                <w:lang w:eastAsia="fr-FR"/>
-              </w:rPr>
-            </w:pPr>
+              <w:jc w:val="center"/>
+              <w:rPr>
+                <w:lang w:eastAsia="fr-FR"/>
+              </w:rPr>
+            </w:pPr>
+            <w:r>
+              <w:rPr>
+                <w:lang w:eastAsia="fr-FR"/>
+              </w:rPr>
+              <w:t>Stocker la période sélectionnée</w:t>
+            </w:r>
+          </w:p>
+          <w:p>
+            <w:pPr>
+              <w:jc w:val="center"/>
+              <w:rPr>
+                <w:lang w:eastAsia="fr-FR"/>
+              </w:rPr>
+            </w:pPr>
+            <w:r>
+              <w:rPr>
+                <w:lang w:eastAsia="fr-FR"/>
+              </w:rPr>
+              <w:t xml:space="preserve"> (</w:t>
+            </w:r>
+            <w:proofErr w:type="gramStart"/>
+            <w:r>
+              <w:rPr>
+                <w:lang w:eastAsia="fr-FR"/>
+              </w:rPr>
+              <w:t>semaine</w:t>
+            </w:r>
+            <w:proofErr w:type="gramEnd"/>
+            <w:r>
+              <w:rPr>
+                <w:lang w:eastAsia="fr-FR"/>
+              </w:rPr>
+              <w:t>, mois, etc.)</w:t>
+            </w:r>
           </w:p>
         </w:tc>
       </w:tr>
@@ -1327,10 +1558,17 @@
           </w:tcPr>
           <w:p>
             <w:pPr>
-              <w:rPr>
-                <w:lang w:eastAsia="fr-FR"/>
-              </w:rPr>
-            </w:pPr>
+              <w:jc w:val="center"/>
+              <w:rPr>
+                <w:lang w:eastAsia="fr-FR"/>
+              </w:rPr>
+            </w:pPr>
+            <w:r>
+              <w:rPr>
+                <w:lang w:eastAsia="fr-FR"/>
+              </w:rPr>
+              <w:t>Mise à jour du total affiché</w:t>
+            </w:r>
           </w:p>
         </w:tc>
       </w:tr>
@@ -1363,10 +1601,21 @@
           </w:tcPr>
           <w:p>
             <w:pPr>
-              <w:rPr>
-                <w:lang w:eastAsia="fr-FR"/>
-              </w:rPr>
-            </w:pPr>
+              <w:jc w:val="center"/>
+              <w:rPr>
+                <w:lang w:eastAsia="fr-FR"/>
+              </w:rPr>
+            </w:pPr>
+            <w:proofErr w:type="spellStart"/>
+            <w:proofErr w:type="gramStart"/>
+            <w:r>
+              <w:rPr>
+                <w:lang w:eastAsia="fr-FR"/>
+              </w:rPr>
+              <w:t>main.dart</w:t>
+            </w:r>
+            <w:proofErr w:type="spellEnd"/>
+            <w:proofErr w:type="gramEnd"/>
           </w:p>
         </w:tc>
       </w:tr>
@@ -1393,7 +1642,7 @@
     </w:p>
     <w:p>
       <w:pPr>
-        <w:pStyle w:val="Titre1"/>
+        <w:pStyle w:val="Heading1"/>
         <w:spacing w:before="0" w:after="0"/>
         <w:rPr>
           <w:rFonts w:eastAsia="Times New Roman"/>
@@ -1437,7 +1686,7 @@
     </w:p>
     <w:tbl>
       <w:tblPr>
-        <w:tblStyle w:val="Grilledutableau"/>
+        <w:tblStyle w:val="TableGrid"/>
         <w:tblW w:w="9351" w:type="dxa"/>
         <w:tblLook w:val="04A0" w:firstRow="1" w:lastRow="0" w:firstColumn="1" w:lastColumn="0" w:noHBand="0" w:noVBand="1"/>
       </w:tblPr>
@@ -1526,10 +1775,17 @@
           </w:tcPr>
           <w:p>
             <w:pPr>
-              <w:rPr>
-                <w:lang w:eastAsia="fr-FR"/>
-              </w:rPr>
-            </w:pPr>
+              <w:jc w:val="center"/>
+              <w:rPr>
+                <w:lang w:eastAsia="fr-FR"/>
+              </w:rPr>
+            </w:pPr>
+            <w:r>
+              <w:rPr>
+                <w:lang w:eastAsia="fr-FR"/>
+              </w:rPr>
+              <w:t>Liste des dépenses</w:t>
+            </w:r>
           </w:p>
         </w:tc>
       </w:tr>
@@ -1562,10 +1818,33 @@
           </w:tcPr>
           <w:p>
             <w:pPr>
-              <w:rPr>
-                <w:lang w:eastAsia="fr-FR"/>
-              </w:rPr>
-            </w:pPr>
+              <w:jc w:val="center"/>
+              <w:rPr>
+                <w:lang w:eastAsia="fr-FR"/>
+              </w:rPr>
+            </w:pPr>
+            <w:proofErr w:type="spellStart"/>
+            <w:r>
+              <w:rPr>
+                <w:lang w:eastAsia="fr-FR"/>
+              </w:rPr>
+              <w:t>HomeScreen</w:t>
+            </w:r>
+            <w:proofErr w:type="spellEnd"/>
+            <w:r>
+              <w:rPr>
+                <w:lang w:eastAsia="fr-FR"/>
+              </w:rPr>
+              <w:t xml:space="preserve">, Historique, </w:t>
+            </w:r>
+            <w:proofErr w:type="spellStart"/>
+            <w:r>
+              <w:rPr>
+                <w:lang w:eastAsia="fr-FR"/>
+              </w:rPr>
+              <w:t>AjouterDepense</w:t>
+            </w:r>
+            <w:proofErr w:type="spellEnd"/>
           </w:p>
         </w:tc>
       </w:tr>
@@ -1598,10 +1877,17 @@
           </w:tcPr>
           <w:p>
             <w:pPr>
-              <w:rPr>
-                <w:lang w:eastAsia="fr-FR"/>
-              </w:rPr>
-            </w:pPr>
+              <w:jc w:val="center"/>
+              <w:rPr>
+                <w:lang w:eastAsia="fr-FR"/>
+              </w:rPr>
+            </w:pPr>
+            <w:r>
+              <w:rPr>
+                <w:lang w:eastAsia="fr-FR"/>
+              </w:rPr>
+              <w:t>Permet d’avoir des données synchronisées entre écrans</w:t>
+            </w:r>
           </w:p>
         </w:tc>
       </w:tr>
@@ -1634,10 +1920,35 @@
           </w:tcPr>
           <w:p>
             <w:pPr>
-              <w:rPr>
-                <w:lang w:eastAsia="fr-FR"/>
-              </w:rPr>
-            </w:pPr>
+              <w:jc w:val="center"/>
+              <w:rPr>
+                <w:lang w:eastAsia="fr-FR"/>
+              </w:rPr>
+            </w:pPr>
+            <w:proofErr w:type="spellStart"/>
+            <w:proofErr w:type="gramStart"/>
+            <w:r>
+              <w:rPr>
+                <w:lang w:eastAsia="fr-FR"/>
+              </w:rPr>
+              <w:t>depense</w:t>
+            </w:r>
+            <w:proofErr w:type="gramEnd"/>
+            <w:r>
+              <w:rPr>
+                <w:lang w:eastAsia="fr-FR"/>
+              </w:rPr>
+              <w:t>_</w:t>
+            </w:r>
+            <w:proofErr w:type="gramStart"/>
+            <w:r>
+              <w:rPr>
+                <w:lang w:eastAsia="fr-FR"/>
+              </w:rPr>
+              <w:t>model.dart</w:t>
+            </w:r>
+            <w:proofErr w:type="spellEnd"/>
+            <w:proofErr w:type="gramEnd"/>
           </w:p>
         </w:tc>
       </w:tr>
@@ -1661,10 +1972,29 @@
           <w14:ligatures w14:val="none"/>
         </w:rPr>
       </w:pPr>
-    </w:p>
-    <w:p>
-      <w:pPr>
-        <w:pStyle w:val="Titre1"/>
+      <w:r>
+        <w:rPr>
+          <w:rFonts w:ascii="Times New Roman" w:eastAsia="Times New Roman" w:hAnsi="Times New Roman" w:cs="Times New Roman"/>
+          <w:kern w:val="0"/>
+          <w:lang w:eastAsia="fr-FR"/>
+          <w14:ligatures w14:val="none"/>
+        </w:rPr>
+        <w:br w:type="page"/>
+      </w:r>
+    </w:p>
+    <w:p>
+      <w:pPr>
+        <w:rPr>
+          <w:rFonts w:ascii="Times New Roman" w:eastAsia="Times New Roman" w:hAnsi="Times New Roman" w:cs="Times New Roman"/>
+          <w:kern w:val="0"/>
+          <w:lang w:eastAsia="fr-FR"/>
+          <w14:ligatures w14:val="none"/>
+        </w:rPr>
+      </w:pPr>
+    </w:p>
+    <w:p>
+      <w:pPr>
+        <w:pStyle w:val="Heading1"/>
         <w:spacing w:before="0" w:after="0"/>
         <w:rPr>
           <w:rFonts w:eastAsia="Times New Roman"/>
@@ -1708,7 +2038,7 @@
     </w:p>
     <w:tbl>
       <w:tblPr>
-        <w:tblStyle w:val="Grilledutableau"/>
+        <w:tblStyle w:val="TableGrid"/>
         <w:tblW w:w="9351" w:type="dxa"/>
         <w:tblLook w:val="04A0" w:firstRow="1" w:lastRow="0" w:firstColumn="1" w:lastColumn="0" w:noHBand="0" w:noVBand="1"/>
       </w:tblPr>
@@ -1797,10 +2127,17 @@
           </w:tcPr>
           <w:p>
             <w:pPr>
-              <w:rPr>
-                <w:lang w:eastAsia="fr-FR"/>
-              </w:rPr>
-            </w:pPr>
+              <w:jc w:val="center"/>
+              <w:rPr>
+                <w:lang w:eastAsia="fr-FR"/>
+              </w:rPr>
+            </w:pPr>
+            <w:r>
+              <w:rPr>
+                <w:lang w:eastAsia="fr-FR"/>
+              </w:rPr>
+              <w:t>Titre, description, montant</w:t>
+            </w:r>
           </w:p>
         </w:tc>
       </w:tr>
@@ -1833,10 +2170,19 @@
           </w:tcPr>
           <w:p>
             <w:pPr>
-              <w:rPr>
-                <w:lang w:eastAsia="fr-FR"/>
-              </w:rPr>
-            </w:pPr>
+              <w:jc w:val="center"/>
+              <w:rPr>
+                <w:lang w:eastAsia="fr-FR"/>
+              </w:rPr>
+            </w:pPr>
+            <w:proofErr w:type="spellStart"/>
+            <w:r>
+              <w:rPr>
+                <w:lang w:eastAsia="fr-FR"/>
+              </w:rPr>
+              <w:t>AjouterDepense</w:t>
+            </w:r>
+            <w:proofErr w:type="spellEnd"/>
           </w:p>
         </w:tc>
       </w:tr>
@@ -1869,10 +2215,31 @@
           </w:tcPr>
           <w:p>
             <w:pPr>
-              <w:rPr>
-                <w:lang w:eastAsia="fr-FR"/>
-              </w:rPr>
-            </w:pPr>
+              <w:jc w:val="center"/>
+              <w:rPr>
+                <w:lang w:eastAsia="fr-FR"/>
+              </w:rPr>
+            </w:pPr>
+            <w:r>
+              <w:rPr>
+                <w:lang w:eastAsia="fr-FR"/>
+              </w:rPr>
+              <w:t xml:space="preserve">Création d’un objet </w:t>
+            </w:r>
+            <w:proofErr w:type="spellStart"/>
+            <w:r>
+              <w:rPr>
+                <w:lang w:eastAsia="fr-FR"/>
+              </w:rPr>
+              <w:t>Depense</w:t>
+            </w:r>
+            <w:proofErr w:type="spellEnd"/>
+            <w:r>
+              <w:rPr>
+                <w:lang w:eastAsia="fr-FR"/>
+              </w:rPr>
+              <w:t xml:space="preserve"> et ajout via Provider</w:t>
+            </w:r>
           </w:p>
         </w:tc>
       </w:tr>
@@ -1905,10 +2272,17 @@
           </w:tcPr>
           <w:p>
             <w:pPr>
-              <w:rPr>
-                <w:lang w:eastAsia="fr-FR"/>
-              </w:rPr>
-            </w:pPr>
+              <w:jc w:val="center"/>
+              <w:rPr>
+                <w:lang w:eastAsia="fr-FR"/>
+              </w:rPr>
+            </w:pPr>
+            <w:r>
+              <w:rPr>
+                <w:lang w:eastAsia="fr-FR"/>
+              </w:rPr>
+              <w:t>Mise à jour de l’historique et du total</w:t>
+            </w:r>
           </w:p>
         </w:tc>
       </w:tr>
@@ -1929,7 +2303,6 @@
               <w:rPr>
                 <w:lang w:eastAsia="fr-FR"/>
               </w:rPr>
-              <w:lastRenderedPageBreak/>
               <w:t>Fichier / emplacement du code</w:t>
             </w:r>
           </w:p>
@@ -1942,10 +2315,35 @@
           </w:tcPr>
           <w:p>
             <w:pPr>
-              <w:rPr>
-                <w:lang w:eastAsia="fr-FR"/>
-              </w:rPr>
-            </w:pPr>
+              <w:jc w:val="center"/>
+              <w:rPr>
+                <w:lang w:eastAsia="fr-FR"/>
+              </w:rPr>
+            </w:pPr>
+            <w:proofErr w:type="spellStart"/>
+            <w:proofErr w:type="gramStart"/>
+            <w:r>
+              <w:rPr>
+                <w:lang w:eastAsia="fr-FR"/>
+              </w:rPr>
+              <w:t>ajoute</w:t>
+            </w:r>
+            <w:proofErr w:type="gramEnd"/>
+            <w:r>
+              <w:rPr>
+                <w:lang w:eastAsia="fr-FR"/>
+              </w:rPr>
+              <w:t>_</w:t>
+            </w:r>
+            <w:proofErr w:type="gramStart"/>
+            <w:r>
+              <w:rPr>
+                <w:lang w:eastAsia="fr-FR"/>
+              </w:rPr>
+              <w:t>depense.dart</w:t>
+            </w:r>
+            <w:proofErr w:type="spellEnd"/>
+            <w:proofErr w:type="gramEnd"/>
           </w:p>
         </w:tc>
       </w:tr>
@@ -1966,7 +2364,7 @@
     </w:p>
     <w:p>
       <w:pPr>
-        <w:pStyle w:val="Titre1"/>
+        <w:pStyle w:val="Heading1"/>
         <w:spacing w:before="0" w:after="0"/>
         <w:rPr>
           <w:rFonts w:eastAsia="Times New Roman"/>
@@ -2010,7 +2408,7 @@
     </w:p>
     <w:tbl>
       <w:tblPr>
-        <w:tblStyle w:val="Grilledutableau"/>
+        <w:tblStyle w:val="TableGrid"/>
         <w:tblW w:w="9351" w:type="dxa"/>
         <w:tblLook w:val="04A0" w:firstRow="1" w:lastRow="0" w:firstColumn="1" w:lastColumn="0" w:noHBand="0" w:noVBand="1"/>
       </w:tblPr>
@@ -2099,10 +2497,17 @@
           </w:tcPr>
           <w:p>
             <w:pPr>
-              <w:rPr>
-                <w:lang w:eastAsia="fr-FR"/>
-              </w:rPr>
-            </w:pPr>
+              <w:jc w:val="center"/>
+              <w:rPr>
+                <w:lang w:eastAsia="fr-FR"/>
+              </w:rPr>
+            </w:pPr>
+            <w:r>
+              <w:rPr>
+                <w:lang w:eastAsia="fr-FR"/>
+              </w:rPr>
+              <w:t>Liste de dépenses</w:t>
+            </w:r>
           </w:p>
         </w:tc>
       </w:tr>
@@ -2135,10 +2540,17 @@
           </w:tcPr>
           <w:p>
             <w:pPr>
-              <w:rPr>
-                <w:lang w:eastAsia="fr-FR"/>
-              </w:rPr>
-            </w:pPr>
+              <w:jc w:val="center"/>
+              <w:rPr>
+                <w:lang w:eastAsia="fr-FR"/>
+              </w:rPr>
+            </w:pPr>
+            <w:r>
+              <w:rPr>
+                <w:lang w:eastAsia="fr-FR"/>
+              </w:rPr>
+              <w:t>Via formulaire ou bouton repas</w:t>
+            </w:r>
           </w:p>
         </w:tc>
       </w:tr>
@@ -2171,10 +2583,17 @@
           </w:tcPr>
           <w:p>
             <w:pPr>
-              <w:rPr>
-                <w:lang w:eastAsia="fr-FR"/>
-              </w:rPr>
-            </w:pPr>
+              <w:jc w:val="center"/>
+              <w:rPr>
+                <w:lang w:eastAsia="fr-FR"/>
+              </w:rPr>
+            </w:pPr>
+            <w:r>
+              <w:rPr>
+                <w:lang w:eastAsia="fr-FR"/>
+              </w:rPr>
+              <w:t>Historique</w:t>
+            </w:r>
           </w:p>
         </w:tc>
       </w:tr>
@@ -2207,10 +2626,21 @@
           </w:tcPr>
           <w:p>
             <w:pPr>
-              <w:rPr>
-                <w:lang w:eastAsia="fr-FR"/>
-              </w:rPr>
-            </w:pPr>
+              <w:jc w:val="center"/>
+              <w:rPr>
+                <w:lang w:eastAsia="fr-FR"/>
+              </w:rPr>
+            </w:pPr>
+            <w:proofErr w:type="spellStart"/>
+            <w:proofErr w:type="gramStart"/>
+            <w:r>
+              <w:rPr>
+                <w:lang w:eastAsia="fr-FR"/>
+              </w:rPr>
+              <w:t>historique.dart</w:t>
+            </w:r>
+            <w:proofErr w:type="spellEnd"/>
+            <w:proofErr w:type="gramEnd"/>
           </w:p>
         </w:tc>
       </w:tr>
@@ -2237,7 +2667,7 @@
     </w:p>
     <w:p>
       <w:pPr>
-        <w:pStyle w:val="Titre1"/>
+        <w:pStyle w:val="Heading1"/>
         <w:spacing w:before="0" w:after="0"/>
         <w:rPr>
           <w:rFonts w:eastAsia="Times New Roman"/>
@@ -2281,7 +2711,7 @@
     </w:p>
     <w:tbl>
       <w:tblPr>
-        <w:tblStyle w:val="Grilledutableau"/>
+        <w:tblStyle w:val="TableGrid"/>
         <w:tblW w:w="9351" w:type="dxa"/>
         <w:tblLook w:val="04A0" w:firstRow="1" w:lastRow="0" w:firstColumn="1" w:lastColumn="0" w:noHBand="0" w:noVBand="1"/>
       </w:tblPr>
@@ -2370,10 +2800,17 @@
           </w:tcPr>
           <w:p>
             <w:pPr>
-              <w:rPr>
-                <w:lang w:eastAsia="fr-FR"/>
-              </w:rPr>
-            </w:pPr>
+              <w:jc w:val="center"/>
+              <w:rPr>
+                <w:lang w:eastAsia="fr-FR"/>
+              </w:rPr>
+            </w:pPr>
+            <w:r>
+              <w:rPr>
+                <w:lang w:eastAsia="fr-FR"/>
+              </w:rPr>
+              <w:t>Liste des dépenses et préférences</w:t>
+            </w:r>
           </w:p>
         </w:tc>
       </w:tr>
@@ -2406,10 +2843,17 @@
           </w:tcPr>
           <w:p>
             <w:pPr>
-              <w:rPr>
-                <w:lang w:eastAsia="fr-FR"/>
-              </w:rPr>
-            </w:pPr>
+              <w:jc w:val="center"/>
+              <w:rPr>
+                <w:lang w:eastAsia="fr-FR"/>
+              </w:rPr>
+            </w:pPr>
+            <w:r>
+              <w:rPr>
+                <w:lang w:eastAsia="fr-FR"/>
+              </w:rPr>
+              <w:t>Conserver les données après fermeture de l’application</w:t>
+            </w:r>
           </w:p>
         </w:tc>
       </w:tr>
@@ -2442,10 +2886,49 @@
           </w:tcPr>
           <w:p>
             <w:pPr>
-              <w:rPr>
-                <w:lang w:eastAsia="fr-FR"/>
-              </w:rPr>
-            </w:pPr>
+              <w:jc w:val="center"/>
+              <w:rPr>
+                <w:lang w:val="en-MY" w:eastAsia="fr-FR"/>
+              </w:rPr>
+            </w:pPr>
+            <w:proofErr w:type="spellStart"/>
+            <w:r>
+              <w:rPr>
+                <w:lang w:val="en-MY" w:eastAsia="fr-FR"/>
+              </w:rPr>
+              <w:t>depense_</w:t>
+            </w:r>
+            <w:proofErr w:type="gramStart"/>
+            <w:r>
+              <w:rPr>
+                <w:lang w:val="en-MY" w:eastAsia="fr-FR"/>
+              </w:rPr>
+              <w:t>model.dart</w:t>
+            </w:r>
+            <w:proofErr w:type="spellEnd"/>
+            <w:proofErr w:type="gramEnd"/>
+            <w:r>
+              <w:rPr>
+                <w:lang w:val="en-MY" w:eastAsia="fr-FR"/>
+              </w:rPr>
+              <w:t xml:space="preserve">, </w:t>
+            </w:r>
+            <w:proofErr w:type="spellStart"/>
+            <w:r>
+              <w:rPr>
+                <w:lang w:val="en-MY" w:eastAsia="fr-FR"/>
+              </w:rPr>
+              <w:t>preferences_</w:t>
+            </w:r>
+            <w:proofErr w:type="gramStart"/>
+            <w:r>
+              <w:rPr>
+                <w:lang w:val="en-MY" w:eastAsia="fr-FR"/>
+              </w:rPr>
+              <w:t>provider.dart</w:t>
+            </w:r>
+            <w:proofErr w:type="spellEnd"/>
+            <w:proofErr w:type="gramEnd"/>
           </w:p>
         </w:tc>
       </w:tr>
@@ -2455,7 +2938,7 @@
         <w:rPr>
           <w:rFonts w:ascii="Times New Roman" w:eastAsia="Times New Roman" w:hAnsi="Times New Roman" w:cs="Times New Roman"/>
           <w:kern w:val="0"/>
-          <w:lang w:eastAsia="fr-FR"/>
+          <w:lang w:val="en-MY" w:eastAsia="fr-FR"/>
           <w14:ligatures w14:val="none"/>
         </w:rPr>
       </w:pPr>
@@ -2465,14 +2948,14 @@
         <w:rPr>
           <w:rFonts w:ascii="Times New Roman" w:eastAsia="Times New Roman" w:hAnsi="Times New Roman" w:cs="Times New Roman"/>
           <w:kern w:val="0"/>
-          <w:lang w:eastAsia="fr-FR"/>
+          <w:lang w:val="en-MY" w:eastAsia="fr-FR"/>
           <w14:ligatures w14:val="none"/>
         </w:rPr>
       </w:pPr>
     </w:p>
     <w:p>
       <w:pPr>
-        <w:pStyle w:val="Titre1"/>
+        <w:pStyle w:val="Heading1"/>
         <w:spacing w:before="0" w:after="0"/>
         <w:rPr>
           <w:rFonts w:eastAsia="Times New Roman"/>
@@ -2516,7 +2999,7 @@
     </w:p>
     <w:tbl>
       <w:tblPr>
-        <w:tblStyle w:val="Grilledutableau"/>
+        <w:tblStyle w:val="TableGrid"/>
         <w:tblW w:w="9351" w:type="dxa"/>
         <w:tblLook w:val="04A0" w:firstRow="1" w:lastRow="0" w:firstColumn="1" w:lastColumn="0" w:noHBand="0" w:noVBand="1"/>
       </w:tblPr>
@@ -2605,10 +3088,17 @@
           </w:tcPr>
           <w:p>
             <w:pPr>
-              <w:rPr>
-                <w:lang w:eastAsia="fr-FR"/>
-              </w:rPr>
-            </w:pPr>
+              <w:jc w:val="center"/>
+              <w:rPr>
+                <w:lang w:eastAsia="fr-FR"/>
+              </w:rPr>
+            </w:pPr>
+            <w:r>
+              <w:rPr>
+                <w:lang w:eastAsia="fr-FR"/>
+              </w:rPr>
+              <w:t>Français</w:t>
+            </w:r>
           </w:p>
         </w:tc>
       </w:tr>
@@ -2641,10 +3131,17 @@
           </w:tcPr>
           <w:p>
             <w:pPr>
-              <w:rPr>
-                <w:lang w:eastAsia="fr-FR"/>
-              </w:rPr>
-            </w:pPr>
+              <w:jc w:val="center"/>
+              <w:rPr>
+                <w:lang w:eastAsia="fr-FR"/>
+              </w:rPr>
+            </w:pPr>
+            <w:r>
+              <w:rPr>
+                <w:lang w:eastAsia="fr-FR"/>
+              </w:rPr>
+              <w:t>Textes de l’interface</w:t>
+            </w:r>
           </w:p>
         </w:tc>
       </w:tr>
@@ -2677,10 +3174,17 @@
           </w:tcPr>
           <w:p>
             <w:pPr>
-              <w:rPr>
-                <w:lang w:eastAsia="fr-FR"/>
-              </w:rPr>
-            </w:pPr>
+              <w:jc w:val="center"/>
+              <w:rPr>
+                <w:lang w:eastAsia="fr-FR"/>
+              </w:rPr>
+            </w:pPr>
+            <w:r>
+              <w:rPr>
+                <w:lang w:eastAsia="fr-FR"/>
+              </w:rPr>
+              <w:t>Widgets</w:t>
+            </w:r>
           </w:p>
         </w:tc>
       </w:tr>
@@ -2689,7 +3193,7 @@
     <w:p/>
     <w:p>
       <w:pPr>
-        <w:pStyle w:val="Titre1"/>
+        <w:pStyle w:val="Heading1"/>
         <w:spacing w:before="0" w:after="0"/>
         <w:rPr>
           <w:rFonts w:eastAsia="Times New Roman"/>
@@ -2733,7 +3237,7 @@
     </w:p>
     <w:tbl>
       <w:tblPr>
-        <w:tblStyle w:val="Grilledutableau"/>
+        <w:tblStyle w:val="TableGrid"/>
         <w:tblW w:w="9351" w:type="dxa"/>
         <w:tblLook w:val="04A0" w:firstRow="1" w:lastRow="0" w:firstColumn="1" w:lastColumn="0" w:noHBand="0" w:noVBand="1"/>
       </w:tblPr>
@@ -2822,10 +3326,17 @@
           </w:tcPr>
           <w:p>
             <w:pPr>
-              <w:rPr>
-                <w:lang w:eastAsia="fr-FR"/>
-              </w:rPr>
-            </w:pPr>
+              <w:jc w:val="center"/>
+              <w:rPr>
+                <w:lang w:eastAsia="fr-FR"/>
+              </w:rPr>
+            </w:pPr>
+            <w:r>
+              <w:rPr>
+                <w:lang w:eastAsia="fr-FR"/>
+              </w:rPr>
+              <w:t>Interface optimisée pour portrait</w:t>
+            </w:r>
           </w:p>
         </w:tc>
       </w:tr>
@@ -2858,10 +3369,17 @@
           </w:tcPr>
           <w:p>
             <w:pPr>
-              <w:rPr>
-                <w:lang w:eastAsia="fr-FR"/>
-              </w:rPr>
-            </w:pPr>
+              <w:jc w:val="center"/>
+              <w:rPr>
+                <w:lang w:eastAsia="fr-FR"/>
+              </w:rPr>
+            </w:pPr>
+            <w:r>
+              <w:rPr>
+                <w:lang w:eastAsia="fr-FR"/>
+              </w:rPr>
+              <w:t>Tous</w:t>
+            </w:r>
           </w:p>
         </w:tc>
       </w:tr>
@@ -2894,10 +3412,17 @@
           </w:tcPr>
           <w:p>
             <w:pPr>
-              <w:rPr>
-                <w:lang w:eastAsia="fr-FR"/>
-              </w:rPr>
-            </w:pPr>
+              <w:jc w:val="center"/>
+              <w:rPr>
+                <w:lang w:eastAsia="fr-FR"/>
+              </w:rPr>
+            </w:pPr>
+            <w:r>
+              <w:rPr>
+                <w:lang w:eastAsia="fr-FR"/>
+              </w:rPr>
+              <w:t>Global</w:t>
+            </w:r>
           </w:p>
         </w:tc>
       </w:tr>
@@ -2924,7 +3449,7 @@
     </w:p>
     <w:p>
       <w:pPr>
-        <w:pStyle w:val="Titre1"/>
+        <w:pStyle w:val="Heading1"/>
         <w:spacing w:before="0" w:after="0"/>
         <w:rPr>
           <w:rFonts w:eastAsia="Times New Roman"/>
@@ -2968,7 +3493,7 @@
     </w:p>
     <w:tbl>
       <w:tblPr>
-        <w:tblStyle w:val="Grilledutableau"/>
+        <w:tblStyle w:val="TableGrid"/>
         <w:tblW w:w="9351" w:type="dxa"/>
         <w:tblLook w:val="04A0" w:firstRow="1" w:lastRow="0" w:firstColumn="1" w:lastColumn="0" w:noHBand="0" w:noVBand="1"/>
       </w:tblPr>
@@ -3057,10 +3582,33 @@
           </w:tcPr>
           <w:p>
             <w:pPr>
-              <w:rPr>
-                <w:lang w:eastAsia="fr-FR"/>
-              </w:rPr>
-            </w:pPr>
+              <w:jc w:val="center"/>
+              <w:rPr>
+                <w:lang w:eastAsia="fr-FR"/>
+              </w:rPr>
+            </w:pPr>
+            <w:proofErr w:type="spellStart"/>
+            <w:r>
+              <w:rPr>
+                <w:lang w:eastAsia="fr-FR"/>
+              </w:rPr>
+              <w:t>BottomNavigationBar</w:t>
+            </w:r>
+            <w:proofErr w:type="spellEnd"/>
+            <w:r>
+              <w:rPr>
+                <w:lang w:eastAsia="fr-FR"/>
+              </w:rPr>
+              <w:t xml:space="preserve"> / </w:t>
+            </w:r>
+            <w:proofErr w:type="spellStart"/>
+            <w:r>
+              <w:rPr>
+                <w:lang w:eastAsia="fr-FR"/>
+              </w:rPr>
+              <w:t>Drawer</w:t>
+            </w:r>
+            <w:proofErr w:type="spellEnd"/>
           </w:p>
         </w:tc>
       </w:tr>
@@ -3093,14 +3641,24 @@
           </w:tcPr>
           <w:p>
             <w:pPr>
-              <w:rPr>
-                <w:lang w:eastAsia="fr-FR"/>
-              </w:rPr>
-            </w:pPr>
+              <w:jc w:val="center"/>
+              <w:rPr>
+                <w:lang w:eastAsia="fr-FR"/>
+              </w:rPr>
+            </w:pPr>
+            <w:r>
+              <w:rPr>
+                <w:lang w:eastAsia="fr-FR"/>
+              </w:rPr>
+              <w:t>Navigation entre écrans</w:t>
+            </w:r>
           </w:p>
         </w:tc>
       </w:tr>
       <w:tr>
+        <w:trPr>
+          <w:trHeight w:val="70"/>
+        </w:trPr>
         <w:tc>
           <w:tcPr>
             <w:tcW w:w="4106" w:type="dxa"/>
@@ -3129,10 +3687,17 @@
           </w:tcPr>
           <w:p>
             <w:pPr>
-              <w:rPr>
-                <w:lang w:eastAsia="fr-FR"/>
-              </w:rPr>
-            </w:pPr>
+              <w:jc w:val="center"/>
+              <w:rPr>
+                <w:lang w:eastAsia="fr-FR"/>
+              </w:rPr>
+            </w:pPr>
+            <w:r>
+              <w:rPr>
+                <w:lang w:eastAsia="fr-FR"/>
+              </w:rPr>
+              <w:t>Tous</w:t>
+            </w:r>
           </w:p>
         </w:tc>
       </w:tr>
@@ -3153,7 +3718,7 @@
     </w:p>
     <w:p>
       <w:pPr>
-        <w:pStyle w:val="Titre1"/>
+        <w:pStyle w:val="Heading1"/>
         <w:spacing w:before="0" w:after="0"/>
         <w:rPr>
           <w:rFonts w:eastAsia="Times New Roman"/>
@@ -3197,7 +3762,7 @@
     </w:p>
     <w:tbl>
       <w:tblPr>
-        <w:tblStyle w:val="Grilledutableau"/>
+        <w:tblStyle w:val="TableGrid"/>
         <w:tblW w:w="9351" w:type="dxa"/>
         <w:tblLook w:val="04A0" w:firstRow="1" w:lastRow="0" w:firstColumn="1" w:lastColumn="0" w:noHBand="0" w:noVBand="1"/>
       </w:tblPr>
@@ -3286,10 +3851,19 @@
           </w:tcPr>
           <w:p>
             <w:pPr>
-              <w:rPr>
-                <w:lang w:eastAsia="fr-FR"/>
-              </w:rPr>
-            </w:pPr>
+              <w:jc w:val="center"/>
+              <w:rPr>
+                <w:lang w:eastAsia="fr-FR"/>
+              </w:rPr>
+            </w:pPr>
+            <w:proofErr w:type="spellStart"/>
+            <w:r>
+              <w:rPr>
+                <w:lang w:eastAsia="fr-FR"/>
+              </w:rPr>
+              <w:t>Dismissible</w:t>
+            </w:r>
+            <w:proofErr w:type="spellEnd"/>
           </w:p>
         </w:tc>
       </w:tr>
@@ -3322,10 +3896,17 @@
           </w:tcPr>
           <w:p>
             <w:pPr>
-              <w:rPr>
-                <w:lang w:eastAsia="fr-FR"/>
-              </w:rPr>
-            </w:pPr>
+              <w:jc w:val="center"/>
+              <w:rPr>
+                <w:lang w:eastAsia="fr-FR"/>
+              </w:rPr>
+            </w:pPr>
+            <w:r>
+              <w:rPr>
+                <w:lang w:eastAsia="fr-FR"/>
+              </w:rPr>
+              <w:t>Supprimer une dépense par glissement</w:t>
+            </w:r>
           </w:p>
         </w:tc>
       </w:tr>
@@ -3358,10 +3939,17 @@
           </w:tcPr>
           <w:p>
             <w:pPr>
-              <w:rPr>
-                <w:lang w:eastAsia="fr-FR"/>
-              </w:rPr>
-            </w:pPr>
+              <w:jc w:val="center"/>
+              <w:rPr>
+                <w:lang w:eastAsia="fr-FR"/>
+              </w:rPr>
+            </w:pPr>
+            <w:r>
+              <w:rPr>
+                <w:lang w:eastAsia="fr-FR"/>
+              </w:rPr>
+              <w:t>Améliore l’expérience utilisateur</w:t>
+            </w:r>
           </w:p>
         </w:tc>
       </w:tr>
@@ -3394,10 +3982,21 @@
           </w:tcPr>
           <w:p>
             <w:pPr>
-              <w:rPr>
-                <w:lang w:eastAsia="fr-FR"/>
-              </w:rPr>
-            </w:pPr>
+              <w:jc w:val="center"/>
+              <w:rPr>
+                <w:lang w:eastAsia="fr-FR"/>
+              </w:rPr>
+            </w:pPr>
+            <w:proofErr w:type="spellStart"/>
+            <w:proofErr w:type="gramStart"/>
+            <w:r>
+              <w:rPr>
+                <w:lang w:eastAsia="fr-FR"/>
+              </w:rPr>
+              <w:t>historique.dart</w:t>
+            </w:r>
+            <w:proofErr w:type="spellEnd"/>
+            <w:proofErr w:type="gramEnd"/>
           </w:p>
         </w:tc>
       </w:tr>
@@ -3460,7 +4059,7 @@
     <w:sdtContent>
       <w:p>
         <w:pPr>
-          <w:pStyle w:val="Pieddepage"/>
+          <w:pStyle w:val="Footer"/>
           <w:jc w:val="center"/>
         </w:pPr>
         <w:r>
@@ -3540,7 +4139,7 @@
 <w:hdr xmlns:wpc="http://schemas.microsoft.com/office/word/2010/wordprocessingCanvas" xmlns:cx="http://schemas.microsoft.com/office/drawing/2014/chartex" xmlns:cx1="http://schemas.microsoft.com/office/drawing/2015/9/8/chartex" xmlns:cx2="http://schemas.microsoft.com/office/drawing/2015/10/21/chartex" xmlns:cx3="http://schemas.microsoft.com/office/drawing/2016/5/9/chartex" xmlns:cx4="http://schemas.microsoft.com/office/drawing/2016/5/10/chartex" xmlns:cx5="http://schemas.microsoft.com/office/drawing/2016/5/11/chartex" xmlns:cx6="http://schemas.microsoft.com/office/drawing/2016/5/12/chartex" xmlns:cx7="http://schemas.microsoft.com/office/drawing/2016/5/13/chartex" xmlns:cx8="http://schemas.microsoft.com/office/drawing/2016/5/14/chartex" xmlns:mc="http://schemas.openxmlformats.org/markup-compatibility/2006" xmlns:aink="http://schemas.microsoft.com/office/drawing/2016/ink" xmlns:am3d="http://schemas.microsoft.com/office/drawing/2017/model3d" xmlns:o="urn:schemas-microsoft-com:office:office" xmlns:oel="http://schemas.microsoft.com/office/2019/extlst" xmlns:r="http://schemas.openxmlformats.org/officeDocument/2006/relationships" xmlns:m="http://schemas.openxmlformats.org/officeDocument/2006/math" xmlns:v="urn:schemas-microsoft-com:vml" xmlns:wp14="http://schemas.microsoft.com/office/word/2010/wordprocessingDrawing" xmlns:wp="http://schemas.openxmlformats.org/drawingml/2006/wordprocessingDrawing" xmlns:w10="urn:schemas-microsoft-com:office:word" xmlns:w="http://schemas.openxmlformats.org/wordprocessingml/2006/main" xmlns:w14="http://schemas.microsoft.com/office/word/2010/wordml" xmlns:w15="http://schemas.microsoft.com/office/word/2012/wordml" xmlns:w16cex="http://schemas.microsoft.com/office/word/2018/wordml/cex" xmlns:w16cid="http://schemas.microsoft.com/office/word/2016/wordml/cid" xmlns:w16="http://schemas.microsoft.com/office/word/2018/wordml" xmlns:w16du="http://schemas.microsoft.com/office/word/2023/wordml/word16du" xmlns:w16sdtdh="http://schemas.microsoft.com/office/word/2020/wordml/sdtdatahash" xmlns:w16sdtfl="http://schemas.microsoft.com/office/word/2024/wordml/sdtformatlock" xmlns:w16se="http://schemas.microsoft.com/office/word/2015/wordml/symex" xmlns:wpg="http://schemas.microsoft.com/office/word/2010/wordprocessingGroup" xmlns:wpi="http://schemas.microsoft.com/office/word/2010/wordprocessingInk" xmlns:wne="http://schemas.microsoft.com/office/word/2006/wordml" xmlns:wps="http://schemas.microsoft.com/office/word/2010/wordprocessingShape" mc:Ignorable="w14 w15 w16se w16cid w16 w16cex w16sdtdh w16sdtfl w16du wp14">
   <w:p>
     <w:pPr>
-      <w:pStyle w:val="En-tte"/>
+      <w:pStyle w:val="Header"/>
       <w:pBdr>
         <w:bottom w:val="single" w:sz="4" w:space="1" w:color="auto"/>
       </w:pBdr>
@@ -3619,6 +4218,231 @@
 <file path=word/numbering.xml><?xml version="1.0" encoding="utf-8"?>
 <w:numbering xmlns:wpc="http://schemas.microsoft.com/office/word/2010/wordprocessingCanvas" xmlns:cx="http://schemas.microsoft.com/office/drawing/2014/chartex" xmlns:cx1="http://schemas.microsoft.com/office/drawing/2015/9/8/chartex" xmlns:cx2="http://schemas.microsoft.com/office/drawing/2015/10/21/chartex" xmlns:cx3="http://schemas.microsoft.com/office/drawing/2016/5/9/chartex" xmlns:cx4="http://schemas.microsoft.com/office/drawing/2016/5/10/chartex" xmlns:cx5="http://schemas.microsoft.com/office/drawing/2016/5/11/chartex" xmlns:cx6="http://schemas.microsoft.com/office/drawing/2016/5/12/chartex" xmlns:cx7="http://schemas.microsoft.com/office/drawing/2016/5/13/chartex" xmlns:cx8="http://schemas.microsoft.com/office/drawing/2016/5/14/chartex" xmlns:mc="http://schemas.openxmlformats.org/markup-compatibility/2006" xmlns:aink="http://schemas.microsoft.com/office/drawing/2016/ink" xmlns:am3d="http://schemas.microsoft.com/office/drawing/2017/model3d" xmlns:o="urn:schemas-microsoft-com:office:office" xmlns:oel="http://schemas.microsoft.com/office/2019/extlst" xmlns:r="http://schemas.openxmlformats.org/officeDocument/2006/relationships" xmlns:m="http://schemas.openxmlformats.org/officeDocument/2006/math" xmlns:v="urn:schemas-microsoft-com:vml" xmlns:wp14="http://schemas.microsoft.com/office/word/2010/wordprocessingDrawing" xmlns:wp="http://schemas.openxmlformats.org/drawingml/2006/wordprocessingDrawing" xmlns:w10="urn:schemas-microsoft-com:office:word" xmlns:w="http://schemas.openxmlformats.org/wordprocessingml/2006/main" xmlns:w14="http://schemas.microsoft.com/office/word/2010/wordml" xmlns:w15="http://schemas.microsoft.com/office/word/2012/wordml" xmlns:w16cex="http://schemas.microsoft.com/office/word/2018/wordml/cex" xmlns:w16cid="http://schemas.microsoft.com/office/word/2016/wordml/cid" xmlns:w16="http://schemas.microsoft.com/office/word/2018/wordml" xmlns:w16du="http://schemas.microsoft.com/office/word/2023/wordml/word16du" xmlns:w16sdtdh="http://schemas.microsoft.com/office/word/2020/wordml/sdtdatahash" xmlns:w16sdtfl="http://schemas.microsoft.com/office/word/2024/wordml/sdtformatlock" xmlns:w16se="http://schemas.microsoft.com/office/word/2015/wordml/symex" xmlns:wpg="http://schemas.microsoft.com/office/word/2010/wordprocessingGroup" xmlns:wpi="http://schemas.microsoft.com/office/word/2010/wordprocessingInk" xmlns:wne="http://schemas.microsoft.com/office/word/2006/wordml" xmlns:wps="http://schemas.microsoft.com/office/word/2010/wordprocessingShape" mc:Ignorable="w14 w15 w16se w16cid w16 w16cex w16sdtdh w16sdtfl w16du wp14">
   <w:abstractNum w:abstractNumId="0" w15:restartNumberingAfterBreak="0">
+    <w:nsid w:val="139155FC"/>
+    <w:multiLevelType w:val="hybridMultilevel"/>
+    <w:tmpl w:val="B55AAC16"/>
+    <w:lvl w:ilvl="0" w:tplc="040C0001">
+      <w:start w:val="1"/>
+      <w:numFmt w:val="bullet"/>
+      <w:lvlText w:val=""/>
+      <w:lvlJc w:val="left"/>
+      <w:pPr>
+        <w:ind w:left="1440" w:hanging="360"/>
+      </w:pPr>
+      <w:rPr>
+        <w:rFonts w:ascii="Symbol" w:hAnsi="Symbol" w:hint="default"/>
+      </w:rPr>
+    </w:lvl>
+    <w:lvl w:ilvl="1" w:tplc="040C0003" w:tentative="1">
+      <w:start w:val="1"/>
+      <w:numFmt w:val="bullet"/>
+      <w:lvlText w:val="o"/>
+      <w:lvlJc w:val="left"/>
+      <w:pPr>
+        <w:ind w:left="2160" w:hanging="360"/>
+      </w:pPr>
+      <w:rPr>
+        <w:rFonts w:ascii="Courier New" w:hAnsi="Courier New" w:cs="Courier New" w:hint="default"/>
+      </w:rPr>
+    </w:lvl>
+    <w:lvl w:ilvl="2" w:tplc="040C0005" w:tentative="1">
+      <w:start w:val="1"/>
+      <w:numFmt w:val="bullet"/>
+      <w:lvlText w:val=""/>
+      <w:lvlJc w:val="left"/>
+      <w:pPr>
+        <w:ind w:left="2880" w:hanging="360"/>
+      </w:pPr>
+      <w:rPr>
+        <w:rFonts w:ascii="Wingdings" w:hAnsi="Wingdings" w:hint="default"/>
+      </w:rPr>
+    </w:lvl>
+    <w:lvl w:ilvl="3" w:tplc="040C0001" w:tentative="1">
+      <w:start w:val="1"/>
+      <w:numFmt w:val="bullet"/>
+      <w:lvlText w:val=""/>
+      <w:lvlJc w:val="left"/>
+      <w:pPr>
+        <w:ind w:left="3600" w:hanging="360"/>
+      </w:pPr>
+      <w:rPr>
+        <w:rFonts w:ascii="Symbol" w:hAnsi="Symbol" w:hint="default"/>
+      </w:rPr>
+    </w:lvl>
+    <w:lvl w:ilvl="4" w:tplc="040C0003" w:tentative="1">
+      <w:start w:val="1"/>
+      <w:numFmt w:val="bullet"/>
+      <w:lvlText w:val="o"/>
+      <w:lvlJc w:val="left"/>
+      <w:pPr>
+        <w:ind w:left="4320" w:hanging="360"/>
+      </w:pPr>
+      <w:rPr>
+        <w:rFonts w:ascii="Courier New" w:hAnsi="Courier New" w:cs="Courier New" w:hint="default"/>
+      </w:rPr>
+    </w:lvl>
+    <w:lvl w:ilvl="5" w:tplc="040C0005" w:tentative="1">
+      <w:start w:val="1"/>
+      <w:numFmt w:val="bullet"/>
+      <w:lvlText w:val=""/>
+      <w:lvlJc w:val="left"/>
+      <w:pPr>
+        <w:ind w:left="5040" w:hanging="360"/>
+      </w:pPr>
+      <w:rPr>
+        <w:rFonts w:ascii="Wingdings" w:hAnsi="Wingdings" w:hint="default"/>
+      </w:rPr>
+    </w:lvl>
+    <w:lvl w:ilvl="6" w:tplc="040C0001" w:tentative="1">
+      <w:start w:val="1"/>
+      <w:numFmt w:val="bullet"/>
+      <w:lvlText w:val=""/>
+      <w:lvlJc w:val="left"/>
+      <w:pPr>
+        <w:ind w:left="5760" w:hanging="360"/>
+      </w:pPr>
+      <w:rPr>
+        <w:rFonts w:ascii="Symbol" w:hAnsi="Symbol" w:hint="default"/>
+      </w:rPr>
+    </w:lvl>
+    <w:lvl w:ilvl="7" w:tplc="040C0003" w:tentative="1">
+      <w:start w:val="1"/>
+      <w:numFmt w:val="bullet"/>
+      <w:lvlText w:val="o"/>
+      <w:lvlJc w:val="left"/>
+      <w:pPr>
+        <w:ind w:left="6480" w:hanging="360"/>
+      </w:pPr>
+      <w:rPr>
+        <w:rFonts w:ascii="Courier New" w:hAnsi="Courier New" w:cs="Courier New" w:hint="default"/>
+      </w:rPr>
+    </w:lvl>
+    <w:lvl w:ilvl="8" w:tplc="040C0005" w:tentative="1">
+      <w:start w:val="1"/>
+      <w:numFmt w:val="bullet"/>
+      <w:lvlText w:val=""/>
+      <w:lvlJc w:val="left"/>
+      <w:pPr>
+        <w:ind w:left="7200" w:hanging="360"/>
+      </w:pPr>
+      <w:rPr>
+        <w:rFonts w:ascii="Wingdings" w:hAnsi="Wingdings" w:hint="default"/>
+      </w:rPr>
+    </w:lvl>
+  </w:abstractNum>
+  <w:abstractNum w:abstractNumId="1" w15:restartNumberingAfterBreak="0">
+    <w:nsid w:val="25CF284B"/>
+    <w:multiLevelType w:val="hybridMultilevel"/>
+    <w:tmpl w:val="EB7A6D64"/>
+    <w:lvl w:ilvl="0" w:tplc="540CE48C">
+      <w:numFmt w:val="bullet"/>
+      <w:lvlText w:val=""/>
+      <w:lvlJc w:val="left"/>
+      <w:pPr>
+        <w:ind w:left="1440" w:hanging="360"/>
+      </w:pPr>
+      <w:rPr>
+        <w:rFonts w:ascii="Aptos" w:eastAsiaTheme="minorHAnsi" w:hAnsi="Aptos" w:cstheme="minorBidi" w:hint="default"/>
+      </w:rPr>
+    </w:lvl>
+    <w:lvl w:ilvl="1" w:tplc="040C0003" w:tentative="1">
+      <w:start w:val="1"/>
+      <w:numFmt w:val="bullet"/>
+      <w:lvlText w:val="o"/>
+      <w:lvlJc w:val="left"/>
+      <w:pPr>
+        <w:ind w:left="2160" w:hanging="360"/>
+      </w:pPr>
+      <w:rPr>
+        <w:rFonts w:ascii="Courier New" w:hAnsi="Courier New" w:cs="Courier New" w:hint="default"/>
+      </w:rPr>
+    </w:lvl>
+    <w:lvl w:ilvl="2" w:tplc="040C0005" w:tentative="1">
+      <w:start w:val="1"/>
+      <w:numFmt w:val="bullet"/>
+      <w:lvlText w:val=""/>
+      <w:lvlJc w:val="left"/>
+      <w:pPr>
+        <w:ind w:left="2880" w:hanging="360"/>
+      </w:pPr>
+      <w:rPr>
+        <w:rFonts w:ascii="Wingdings" w:hAnsi="Wingdings" w:hint="default"/>
+      </w:rPr>
+    </w:lvl>
+    <w:lvl w:ilvl="3" w:tplc="040C0001" w:tentative="1">
+      <w:start w:val="1"/>
+      <w:numFmt w:val="bullet"/>
+      <w:lvlText w:val=""/>
+      <w:lvlJc w:val="left"/>
+      <w:pPr>
+        <w:ind w:left="3600" w:hanging="360"/>
+      </w:pPr>
+      <w:rPr>
+        <w:rFonts w:ascii="Symbol" w:hAnsi="Symbol" w:hint="default"/>
+      </w:rPr>
+    </w:lvl>
+    <w:lvl w:ilvl="4" w:tplc="040C0003" w:tentative="1">
+      <w:start w:val="1"/>
+      <w:numFmt w:val="bullet"/>
+      <w:lvlText w:val="o"/>
+      <w:lvlJc w:val="left"/>
+      <w:pPr>
+        <w:ind w:left="4320" w:hanging="360"/>
+      </w:pPr>
+      <w:rPr>
+        <w:rFonts w:ascii="Courier New" w:hAnsi="Courier New" w:cs="Courier New" w:hint="default"/>
+      </w:rPr>
+    </w:lvl>
+    <w:lvl w:ilvl="5" w:tplc="040C0005" w:tentative="1">
+      <w:start w:val="1"/>
+      <w:numFmt w:val="bullet"/>
+      <w:lvlText w:val=""/>
+      <w:lvlJc w:val="left"/>
+      <w:pPr>
+        <w:ind w:left="5040" w:hanging="360"/>
+      </w:pPr>
+      <w:rPr>
+        <w:rFonts w:ascii="Wingdings" w:hAnsi="Wingdings" w:hint="default"/>
+      </w:rPr>
+    </w:lvl>
+    <w:lvl w:ilvl="6" w:tplc="040C0001" w:tentative="1">
+      <w:start w:val="1"/>
+      <w:numFmt w:val="bullet"/>
+      <w:lvlText w:val=""/>
+      <w:lvlJc w:val="left"/>
+      <w:pPr>
+        <w:ind w:left="5760" w:hanging="360"/>
+      </w:pPr>
+      <w:rPr>
+        <w:rFonts w:ascii="Symbol" w:hAnsi="Symbol" w:hint="default"/>
+      </w:rPr>
+    </w:lvl>
+    <w:lvl w:ilvl="7" w:tplc="040C0003" w:tentative="1">
+      <w:start w:val="1"/>
+      <w:numFmt w:val="bullet"/>
+      <w:lvlText w:val="o"/>
+      <w:lvlJc w:val="left"/>
+      <w:pPr>
+        <w:ind w:left="6480" w:hanging="360"/>
+      </w:pPr>
+      <w:rPr>
+        <w:rFonts w:ascii="Courier New" w:hAnsi="Courier New" w:cs="Courier New" w:hint="default"/>
+      </w:rPr>
+    </w:lvl>
+    <w:lvl w:ilvl="8" w:tplc="040C0005" w:tentative="1">
+      <w:start w:val="1"/>
+      <w:numFmt w:val="bullet"/>
+      <w:lvlText w:val=""/>
+      <w:lvlJc w:val="left"/>
+      <w:pPr>
+        <w:ind w:left="7200" w:hanging="360"/>
+      </w:pPr>
+      <w:rPr>
+        <w:rFonts w:ascii="Wingdings" w:hAnsi="Wingdings" w:hint="default"/>
+      </w:rPr>
+    </w:lvl>
+  </w:abstractNum>
+  <w:abstractNum w:abstractNumId="2" w15:restartNumberingAfterBreak="0">
     <w:nsid w:val="37683F77"/>
     <w:multiLevelType w:val="hybridMultilevel"/>
     <w:tmpl w:val="40627ED4"/>
@@ -3707,7 +4531,7 @@
       </w:pPr>
     </w:lvl>
   </w:abstractNum>
-  <w:abstractNum w:abstractNumId="1" w15:restartNumberingAfterBreak="0">
+  <w:abstractNum w:abstractNumId="3" w15:restartNumberingAfterBreak="0">
     <w:nsid w:val="3C583108"/>
     <w:multiLevelType w:val="hybridMultilevel"/>
     <w:tmpl w:val="67E05F70"/>
@@ -3796,7 +4620,232 @@
       </w:pPr>
     </w:lvl>
   </w:abstractNum>
-  <w:abstractNum w:abstractNumId="2" w15:restartNumberingAfterBreak="0">
+  <w:abstractNum w:abstractNumId="4" w15:restartNumberingAfterBreak="0">
+    <w:nsid w:val="5A8B3D46"/>
+    <w:multiLevelType w:val="hybridMultilevel"/>
+    <w:tmpl w:val="D38EA5F4"/>
+    <w:lvl w:ilvl="0" w:tplc="040C0001">
+      <w:start w:val="1"/>
+      <w:numFmt w:val="bullet"/>
+      <w:lvlText w:val=""/>
+      <w:lvlJc w:val="left"/>
+      <w:pPr>
+        <w:ind w:left="1440" w:hanging="360"/>
+      </w:pPr>
+      <w:rPr>
+        <w:rFonts w:ascii="Symbol" w:hAnsi="Symbol" w:hint="default"/>
+      </w:rPr>
+    </w:lvl>
+    <w:lvl w:ilvl="1" w:tplc="040C0003" w:tentative="1">
+      <w:start w:val="1"/>
+      <w:numFmt w:val="bullet"/>
+      <w:lvlText w:val="o"/>
+      <w:lvlJc w:val="left"/>
+      <w:pPr>
+        <w:ind w:left="2160" w:hanging="360"/>
+      </w:pPr>
+      <w:rPr>
+        <w:rFonts w:ascii="Courier New" w:hAnsi="Courier New" w:cs="Courier New" w:hint="default"/>
+      </w:rPr>
+    </w:lvl>
+    <w:lvl w:ilvl="2" w:tplc="040C0005" w:tentative="1">
+      <w:start w:val="1"/>
+      <w:numFmt w:val="bullet"/>
+      <w:lvlText w:val=""/>
+      <w:lvlJc w:val="left"/>
+      <w:pPr>
+        <w:ind w:left="2880" w:hanging="360"/>
+      </w:pPr>
+      <w:rPr>
+        <w:rFonts w:ascii="Wingdings" w:hAnsi="Wingdings" w:hint="default"/>
+      </w:rPr>
+    </w:lvl>
+    <w:lvl w:ilvl="3" w:tplc="040C0001" w:tentative="1">
+      <w:start w:val="1"/>
+      <w:numFmt w:val="bullet"/>
+      <w:lvlText w:val=""/>
+      <w:lvlJc w:val="left"/>
+      <w:pPr>
+        <w:ind w:left="3600" w:hanging="360"/>
+      </w:pPr>
+      <w:rPr>
+        <w:rFonts w:ascii="Symbol" w:hAnsi="Symbol" w:hint="default"/>
+      </w:rPr>
+    </w:lvl>
+    <w:lvl w:ilvl="4" w:tplc="040C0003" w:tentative="1">
+      <w:start w:val="1"/>
+      <w:numFmt w:val="bullet"/>
+      <w:lvlText w:val="o"/>
+      <w:lvlJc w:val="left"/>
+      <w:pPr>
+        <w:ind w:left="4320" w:hanging="360"/>
+      </w:pPr>
+      <w:rPr>
+        <w:rFonts w:ascii="Courier New" w:hAnsi="Courier New" w:cs="Courier New" w:hint="default"/>
+      </w:rPr>
+    </w:lvl>
+    <w:lvl w:ilvl="5" w:tplc="040C0005" w:tentative="1">
+      <w:start w:val="1"/>
+      <w:numFmt w:val="bullet"/>
+      <w:lvlText w:val=""/>
+      <w:lvlJc w:val="left"/>
+      <w:pPr>
+        <w:ind w:left="5040" w:hanging="360"/>
+      </w:pPr>
+      <w:rPr>
+        <w:rFonts w:ascii="Wingdings" w:hAnsi="Wingdings" w:hint="default"/>
+      </w:rPr>
+    </w:lvl>
+    <w:lvl w:ilvl="6" w:tplc="040C0001" w:tentative="1">
+      <w:start w:val="1"/>
+      <w:numFmt w:val="bullet"/>
+      <w:lvlText w:val=""/>
+      <w:lvlJc w:val="left"/>
+      <w:pPr>
+        <w:ind w:left="5760" w:hanging="360"/>
+      </w:pPr>
+      <w:rPr>
+        <w:rFonts w:ascii="Symbol" w:hAnsi="Symbol" w:hint="default"/>
+      </w:rPr>
+    </w:lvl>
+    <w:lvl w:ilvl="7" w:tplc="040C0003" w:tentative="1">
+      <w:start w:val="1"/>
+      <w:numFmt w:val="bullet"/>
+      <w:lvlText w:val="o"/>
+      <w:lvlJc w:val="left"/>
+      <w:pPr>
+        <w:ind w:left="6480" w:hanging="360"/>
+      </w:pPr>
+      <w:rPr>
+        <w:rFonts w:ascii="Courier New" w:hAnsi="Courier New" w:cs="Courier New" w:hint="default"/>
+      </w:rPr>
+    </w:lvl>
+    <w:lvl w:ilvl="8" w:tplc="040C0005" w:tentative="1">
+      <w:start w:val="1"/>
+      <w:numFmt w:val="bullet"/>
+      <w:lvlText w:val=""/>
+      <w:lvlJc w:val="left"/>
+      <w:pPr>
+        <w:ind w:left="7200" w:hanging="360"/>
+      </w:pPr>
+      <w:rPr>
+        <w:rFonts w:ascii="Wingdings" w:hAnsi="Wingdings" w:hint="default"/>
+      </w:rPr>
+    </w:lvl>
+  </w:abstractNum>
+  <w:abstractNum w:abstractNumId="5" w15:restartNumberingAfterBreak="0">
+    <w:nsid w:val="5D374595"/>
+    <w:multiLevelType w:val="hybridMultilevel"/>
+    <w:tmpl w:val="8890A802"/>
+    <w:lvl w:ilvl="0" w:tplc="5FEEBA46">
+      <w:numFmt w:val="bullet"/>
+      <w:lvlText w:val=""/>
+      <w:lvlJc w:val="left"/>
+      <w:pPr>
+        <w:ind w:left="1080" w:hanging="360"/>
+      </w:pPr>
+      <w:rPr>
+        <w:rFonts w:ascii="Aptos" w:eastAsiaTheme="minorHAnsi" w:hAnsi="Aptos" w:cstheme="minorBidi" w:hint="default"/>
+      </w:rPr>
+    </w:lvl>
+    <w:lvl w:ilvl="1" w:tplc="040C0003" w:tentative="1">
+      <w:start w:val="1"/>
+      <w:numFmt w:val="bullet"/>
+      <w:lvlText w:val="o"/>
+      <w:lvlJc w:val="left"/>
+      <w:pPr>
+        <w:ind w:left="1800" w:hanging="360"/>
+      </w:pPr>
+      <w:rPr>
+        <w:rFonts w:ascii="Courier New" w:hAnsi="Courier New" w:cs="Courier New" w:hint="default"/>
+      </w:rPr>
+    </w:lvl>
+    <w:lvl w:ilvl="2" w:tplc="040C0005" w:tentative="1">
+      <w:start w:val="1"/>
+      <w:numFmt w:val="bullet"/>
+      <w:lvlText w:val=""/>
+      <w:lvlJc w:val="left"/>
+      <w:pPr>
+        <w:ind w:left="2520" w:hanging="360"/>
+      </w:pPr>
+      <w:rPr>
+        <w:rFonts w:ascii="Wingdings" w:hAnsi="Wingdings" w:hint="default"/>
+      </w:rPr>
+    </w:lvl>
+    <w:lvl w:ilvl="3" w:tplc="040C0001" w:tentative="1">
+      <w:start w:val="1"/>
+      <w:numFmt w:val="bullet"/>
+      <w:lvlText w:val=""/>
+      <w:lvlJc w:val="left"/>
+      <w:pPr>
+        <w:ind w:left="3240" w:hanging="360"/>
+      </w:pPr>
+      <w:rPr>
+        <w:rFonts w:ascii="Symbol" w:hAnsi="Symbol" w:hint="default"/>
+      </w:rPr>
+    </w:lvl>
+    <w:lvl w:ilvl="4" w:tplc="040C0003" w:tentative="1">
+      <w:start w:val="1"/>
+      <w:numFmt w:val="bullet"/>
+      <w:lvlText w:val="o"/>
+      <w:lvlJc w:val="left"/>
+      <w:pPr>
+        <w:ind w:left="3960" w:hanging="360"/>
+      </w:pPr>
+      <w:rPr>
+        <w:rFonts w:ascii="Courier New" w:hAnsi="Courier New" w:cs="Courier New" w:hint="default"/>
+      </w:rPr>
+    </w:lvl>
+    <w:lvl w:ilvl="5" w:tplc="040C0005" w:tentative="1">
+      <w:start w:val="1"/>
+      <w:numFmt w:val="bullet"/>
+      <w:lvlText w:val=""/>
+      <w:lvlJc w:val="left"/>
+      <w:pPr>
+        <w:ind w:left="4680" w:hanging="360"/>
+      </w:pPr>
+      <w:rPr>
+        <w:rFonts w:ascii="Wingdings" w:hAnsi="Wingdings" w:hint="default"/>
+      </w:rPr>
+    </w:lvl>
+    <w:lvl w:ilvl="6" w:tplc="040C0001" w:tentative="1">
+      <w:start w:val="1"/>
+      <w:numFmt w:val="bullet"/>
+      <w:lvlText w:val=""/>
+      <w:lvlJc w:val="left"/>
+      <w:pPr>
+        <w:ind w:left="5400" w:hanging="360"/>
+      </w:pPr>
+      <w:rPr>
+        <w:rFonts w:ascii="Symbol" w:hAnsi="Symbol" w:hint="default"/>
+      </w:rPr>
+    </w:lvl>
+    <w:lvl w:ilvl="7" w:tplc="040C0003" w:tentative="1">
+      <w:start w:val="1"/>
+      <w:numFmt w:val="bullet"/>
+      <w:lvlText w:val="o"/>
+      <w:lvlJc w:val="left"/>
+      <w:pPr>
+        <w:ind w:left="6120" w:hanging="360"/>
+      </w:pPr>
+      <w:rPr>
+        <w:rFonts w:ascii="Courier New" w:hAnsi="Courier New" w:cs="Courier New" w:hint="default"/>
+      </w:rPr>
+    </w:lvl>
+    <w:lvl w:ilvl="8" w:tplc="040C0005" w:tentative="1">
+      <w:start w:val="1"/>
+      <w:numFmt w:val="bullet"/>
+      <w:lvlText w:val=""/>
+      <w:lvlJc w:val="left"/>
+      <w:pPr>
+        <w:ind w:left="6840" w:hanging="360"/>
+      </w:pPr>
+      <w:rPr>
+        <w:rFonts w:ascii="Wingdings" w:hAnsi="Wingdings" w:hint="default"/>
+      </w:rPr>
+    </w:lvl>
+  </w:abstractNum>
+  <w:abstractNum w:abstractNumId="6" w15:restartNumberingAfterBreak="0">
     <w:nsid w:val="61011D42"/>
     <w:multiLevelType w:val="multilevel"/>
     <w:tmpl w:val="64105A78"/>
@@ -3945,14 +4994,351 @@
       </w:rPr>
     </w:lvl>
   </w:abstractNum>
-  <w:abstractNum w:abstractNumId="3" w15:restartNumberingAfterBreak="0">
+  <w:abstractNum w:abstractNumId="7" w15:restartNumberingAfterBreak="0">
+    <w:nsid w:val="638D7058"/>
+    <w:multiLevelType w:val="hybridMultilevel"/>
+    <w:tmpl w:val="7A6CE234"/>
+    <w:lvl w:ilvl="0" w:tplc="540CE48C">
+      <w:numFmt w:val="bullet"/>
+      <w:lvlText w:val=""/>
+      <w:lvlJc w:val="left"/>
+      <w:pPr>
+        <w:ind w:left="720" w:hanging="360"/>
+      </w:pPr>
+      <w:rPr>
+        <w:rFonts w:ascii="Aptos" w:eastAsiaTheme="minorHAnsi" w:hAnsi="Aptos" w:cstheme="minorBidi" w:hint="default"/>
+      </w:rPr>
+    </w:lvl>
+    <w:lvl w:ilvl="1" w:tplc="040C0003" w:tentative="1">
+      <w:start w:val="1"/>
+      <w:numFmt w:val="bullet"/>
+      <w:lvlText w:val="o"/>
+      <w:lvlJc w:val="left"/>
+      <w:pPr>
+        <w:ind w:left="1440" w:hanging="360"/>
+      </w:pPr>
+      <w:rPr>
+        <w:rFonts w:ascii="Courier New" w:hAnsi="Courier New" w:cs="Courier New" w:hint="default"/>
+      </w:rPr>
+    </w:lvl>
+    <w:lvl w:ilvl="2" w:tplc="040C0005" w:tentative="1">
+      <w:start w:val="1"/>
+      <w:numFmt w:val="bullet"/>
+      <w:lvlText w:val=""/>
+      <w:lvlJc w:val="left"/>
+      <w:pPr>
+        <w:ind w:left="2160" w:hanging="360"/>
+      </w:pPr>
+      <w:rPr>
+        <w:rFonts w:ascii="Wingdings" w:hAnsi="Wingdings" w:hint="default"/>
+      </w:rPr>
+    </w:lvl>
+    <w:lvl w:ilvl="3" w:tplc="040C0001" w:tentative="1">
+      <w:start w:val="1"/>
+      <w:numFmt w:val="bullet"/>
+      <w:lvlText w:val=""/>
+      <w:lvlJc w:val="left"/>
+      <w:pPr>
+        <w:ind w:left="2880" w:hanging="360"/>
+      </w:pPr>
+      <w:rPr>
+        <w:rFonts w:ascii="Symbol" w:hAnsi="Symbol" w:hint="default"/>
+      </w:rPr>
+    </w:lvl>
+    <w:lvl w:ilvl="4" w:tplc="040C0003" w:tentative="1">
+      <w:start w:val="1"/>
+      <w:numFmt w:val="bullet"/>
+      <w:lvlText w:val="o"/>
+      <w:lvlJc w:val="left"/>
+      <w:pPr>
+        <w:ind w:left="3600" w:hanging="360"/>
+      </w:pPr>
+      <w:rPr>
+        <w:rFonts w:ascii="Courier New" w:hAnsi="Courier New" w:cs="Courier New" w:hint="default"/>
+      </w:rPr>
+    </w:lvl>
+    <w:lvl w:ilvl="5" w:tplc="040C0005" w:tentative="1">
+      <w:start w:val="1"/>
+      <w:numFmt w:val="bullet"/>
+      <w:lvlText w:val=""/>
+      <w:lvlJc w:val="left"/>
+      <w:pPr>
+        <w:ind w:left="4320" w:hanging="360"/>
+      </w:pPr>
+      <w:rPr>
+        <w:rFonts w:ascii="Wingdings" w:hAnsi="Wingdings" w:hint="default"/>
+      </w:rPr>
+    </w:lvl>
+    <w:lvl w:ilvl="6" w:tplc="040C0001" w:tentative="1">
+      <w:start w:val="1"/>
+      <w:numFmt w:val="bullet"/>
+      <w:lvlText w:val=""/>
+      <w:lvlJc w:val="left"/>
+      <w:pPr>
+        <w:ind w:left="5040" w:hanging="360"/>
+      </w:pPr>
+      <w:rPr>
+        <w:rFonts w:ascii="Symbol" w:hAnsi="Symbol" w:hint="default"/>
+      </w:rPr>
+    </w:lvl>
+    <w:lvl w:ilvl="7" w:tplc="040C0003" w:tentative="1">
+      <w:start w:val="1"/>
+      <w:numFmt w:val="bullet"/>
+      <w:lvlText w:val="o"/>
+      <w:lvlJc w:val="left"/>
+      <w:pPr>
+        <w:ind w:left="5760" w:hanging="360"/>
+      </w:pPr>
+      <w:rPr>
+        <w:rFonts w:ascii="Courier New" w:hAnsi="Courier New" w:cs="Courier New" w:hint="default"/>
+      </w:rPr>
+    </w:lvl>
+    <w:lvl w:ilvl="8" w:tplc="040C0005" w:tentative="1">
+      <w:start w:val="1"/>
+      <w:numFmt w:val="bullet"/>
+      <w:lvlText w:val=""/>
+      <w:lvlJc w:val="left"/>
+      <w:pPr>
+        <w:ind w:left="6480" w:hanging="360"/>
+      </w:pPr>
+      <w:rPr>
+        <w:rFonts w:ascii="Wingdings" w:hAnsi="Wingdings" w:hint="default"/>
+      </w:rPr>
+    </w:lvl>
+  </w:abstractNum>
+  <w:abstractNum w:abstractNumId="8" w15:restartNumberingAfterBreak="0">
+    <w:nsid w:val="771A6677"/>
+    <w:multiLevelType w:val="hybridMultilevel"/>
+    <w:tmpl w:val="5028A724"/>
+    <w:lvl w:ilvl="0" w:tplc="5FEEBA46">
+      <w:numFmt w:val="bullet"/>
+      <w:lvlText w:val=""/>
+      <w:lvlJc w:val="left"/>
+      <w:pPr>
+        <w:ind w:left="1800" w:hanging="360"/>
+      </w:pPr>
+      <w:rPr>
+        <w:rFonts w:ascii="Aptos" w:eastAsiaTheme="minorHAnsi" w:hAnsi="Aptos" w:cstheme="minorBidi" w:hint="default"/>
+      </w:rPr>
+    </w:lvl>
+    <w:lvl w:ilvl="1" w:tplc="040C0003" w:tentative="1">
+      <w:start w:val="1"/>
+      <w:numFmt w:val="bullet"/>
+      <w:lvlText w:val="o"/>
+      <w:lvlJc w:val="left"/>
+      <w:pPr>
+        <w:ind w:left="2160" w:hanging="360"/>
+      </w:pPr>
+      <w:rPr>
+        <w:rFonts w:ascii="Courier New" w:hAnsi="Courier New" w:cs="Courier New" w:hint="default"/>
+      </w:rPr>
+    </w:lvl>
+    <w:lvl w:ilvl="2" w:tplc="040C0005" w:tentative="1">
+      <w:start w:val="1"/>
+      <w:numFmt w:val="bullet"/>
+      <w:lvlText w:val=""/>
+      <w:lvlJc w:val="left"/>
+      <w:pPr>
+        <w:ind w:left="2880" w:hanging="360"/>
+      </w:pPr>
+      <w:rPr>
+        <w:rFonts w:ascii="Wingdings" w:hAnsi="Wingdings" w:hint="default"/>
+      </w:rPr>
+    </w:lvl>
+    <w:lvl w:ilvl="3" w:tplc="040C0001" w:tentative="1">
+      <w:start w:val="1"/>
+      <w:numFmt w:val="bullet"/>
+      <w:lvlText w:val=""/>
+      <w:lvlJc w:val="left"/>
+      <w:pPr>
+        <w:ind w:left="3600" w:hanging="360"/>
+      </w:pPr>
+      <w:rPr>
+        <w:rFonts w:ascii="Symbol" w:hAnsi="Symbol" w:hint="default"/>
+      </w:rPr>
+    </w:lvl>
+    <w:lvl w:ilvl="4" w:tplc="040C0003" w:tentative="1">
+      <w:start w:val="1"/>
+      <w:numFmt w:val="bullet"/>
+      <w:lvlText w:val="o"/>
+      <w:lvlJc w:val="left"/>
+      <w:pPr>
+        <w:ind w:left="4320" w:hanging="360"/>
+      </w:pPr>
+      <w:rPr>
+        <w:rFonts w:ascii="Courier New" w:hAnsi="Courier New" w:cs="Courier New" w:hint="default"/>
+      </w:rPr>
+    </w:lvl>
+    <w:lvl w:ilvl="5" w:tplc="040C0005" w:tentative="1">
+      <w:start w:val="1"/>
+      <w:numFmt w:val="bullet"/>
+      <w:lvlText w:val=""/>
+      <w:lvlJc w:val="left"/>
+      <w:pPr>
+        <w:ind w:left="5040" w:hanging="360"/>
+      </w:pPr>
+      <w:rPr>
+        <w:rFonts w:ascii="Wingdings" w:hAnsi="Wingdings" w:hint="default"/>
+      </w:rPr>
+    </w:lvl>
+    <w:lvl w:ilvl="6" w:tplc="040C0001" w:tentative="1">
+      <w:start w:val="1"/>
+      <w:numFmt w:val="bullet"/>
+      <w:lvlText w:val=""/>
+      <w:lvlJc w:val="left"/>
+      <w:pPr>
+        <w:ind w:left="5760" w:hanging="360"/>
+      </w:pPr>
+      <w:rPr>
+        <w:rFonts w:ascii="Symbol" w:hAnsi="Symbol" w:hint="default"/>
+      </w:rPr>
+    </w:lvl>
+    <w:lvl w:ilvl="7" w:tplc="040C0003" w:tentative="1">
+      <w:start w:val="1"/>
+      <w:numFmt w:val="bullet"/>
+      <w:lvlText w:val="o"/>
+      <w:lvlJc w:val="left"/>
+      <w:pPr>
+        <w:ind w:left="6480" w:hanging="360"/>
+      </w:pPr>
+      <w:rPr>
+        <w:rFonts w:ascii="Courier New" w:hAnsi="Courier New" w:cs="Courier New" w:hint="default"/>
+      </w:rPr>
+    </w:lvl>
+    <w:lvl w:ilvl="8" w:tplc="040C0005" w:tentative="1">
+      <w:start w:val="1"/>
+      <w:numFmt w:val="bullet"/>
+      <w:lvlText w:val=""/>
+      <w:lvlJc w:val="left"/>
+      <w:pPr>
+        <w:ind w:left="7200" w:hanging="360"/>
+      </w:pPr>
+      <w:rPr>
+        <w:rFonts w:ascii="Wingdings" w:hAnsi="Wingdings" w:hint="default"/>
+      </w:rPr>
+    </w:lvl>
+  </w:abstractNum>
+  <w:abstractNum w:abstractNumId="9" w15:restartNumberingAfterBreak="0">
+    <w:nsid w:val="7BEB319C"/>
+    <w:multiLevelType w:val="hybridMultilevel"/>
+    <w:tmpl w:val="CBD2BDB4"/>
+    <w:lvl w:ilvl="0" w:tplc="040C0001">
+      <w:start w:val="1"/>
+      <w:numFmt w:val="bullet"/>
+      <w:lvlText w:val=""/>
+      <w:lvlJc w:val="left"/>
+      <w:pPr>
+        <w:ind w:left="720" w:hanging="360"/>
+      </w:pPr>
+      <w:rPr>
+        <w:rFonts w:ascii="Symbol" w:hAnsi="Symbol" w:hint="default"/>
+      </w:rPr>
+    </w:lvl>
+    <w:lvl w:ilvl="1" w:tplc="040C0003" w:tentative="1">
+      <w:start w:val="1"/>
+      <w:numFmt w:val="bullet"/>
+      <w:lvlText w:val="o"/>
+      <w:lvlJc w:val="left"/>
+      <w:pPr>
+        <w:ind w:left="1440" w:hanging="360"/>
+      </w:pPr>
+      <w:rPr>
+        <w:rFonts w:ascii="Courier New" w:hAnsi="Courier New" w:cs="Courier New" w:hint="default"/>
+      </w:rPr>
+    </w:lvl>
+    <w:lvl w:ilvl="2" w:tplc="040C0005" w:tentative="1">
+      <w:start w:val="1"/>
+      <w:numFmt w:val="bullet"/>
+      <w:lvlText w:val=""/>
+      <w:lvlJc w:val="left"/>
+      <w:pPr>
+        <w:ind w:left="2160" w:hanging="360"/>
+      </w:pPr>
+      <w:rPr>
+        <w:rFonts w:ascii="Wingdings" w:hAnsi="Wingdings" w:hint="default"/>
+      </w:rPr>
+    </w:lvl>
+    <w:lvl w:ilvl="3" w:tplc="040C0001" w:tentative="1">
+      <w:start w:val="1"/>
+      <w:numFmt w:val="bullet"/>
+      <w:lvlText w:val=""/>
+      <w:lvlJc w:val="left"/>
+      <w:pPr>
+        <w:ind w:left="2880" w:hanging="360"/>
+      </w:pPr>
+      <w:rPr>
+        <w:rFonts w:ascii="Symbol" w:hAnsi="Symbol" w:hint="default"/>
+      </w:rPr>
+    </w:lvl>
+    <w:lvl w:ilvl="4" w:tplc="040C0003" w:tentative="1">
+      <w:start w:val="1"/>
+      <w:numFmt w:val="bullet"/>
+      <w:lvlText w:val="o"/>
+      <w:lvlJc w:val="left"/>
+      <w:pPr>
+        <w:ind w:left="3600" w:hanging="360"/>
+      </w:pPr>
+      <w:rPr>
+        <w:rFonts w:ascii="Courier New" w:hAnsi="Courier New" w:cs="Courier New" w:hint="default"/>
+      </w:rPr>
+    </w:lvl>
+    <w:lvl w:ilvl="5" w:tplc="040C0005" w:tentative="1">
+      <w:start w:val="1"/>
+      <w:numFmt w:val="bullet"/>
+      <w:lvlText w:val=""/>
+      <w:lvlJc w:val="left"/>
+      <w:pPr>
+        <w:ind w:left="4320" w:hanging="360"/>
+      </w:pPr>
+      <w:rPr>
+        <w:rFonts w:ascii="Wingdings" w:hAnsi="Wingdings" w:hint="default"/>
+      </w:rPr>
+    </w:lvl>
+    <w:lvl w:ilvl="6" w:tplc="040C0001" w:tentative="1">
+      <w:start w:val="1"/>
+      <w:numFmt w:val="bullet"/>
+      <w:lvlText w:val=""/>
+      <w:lvlJc w:val="left"/>
+      <w:pPr>
+        <w:ind w:left="5040" w:hanging="360"/>
+      </w:pPr>
+      <w:rPr>
+        <w:rFonts w:ascii="Symbol" w:hAnsi="Symbol" w:hint="default"/>
+      </w:rPr>
+    </w:lvl>
+    <w:lvl w:ilvl="7" w:tplc="040C0003" w:tentative="1">
+      <w:start w:val="1"/>
+      <w:numFmt w:val="bullet"/>
+      <w:lvlText w:val="o"/>
+      <w:lvlJc w:val="left"/>
+      <w:pPr>
+        <w:ind w:left="5760" w:hanging="360"/>
+      </w:pPr>
+      <w:rPr>
+        <w:rFonts w:ascii="Courier New" w:hAnsi="Courier New" w:cs="Courier New" w:hint="default"/>
+      </w:rPr>
+    </w:lvl>
+    <w:lvl w:ilvl="8" w:tplc="040C0005" w:tentative="1">
+      <w:start w:val="1"/>
+      <w:numFmt w:val="bullet"/>
+      <w:lvlText w:val=""/>
+      <w:lvlJc w:val="left"/>
+      <w:pPr>
+        <w:ind w:left="6480" w:hanging="360"/>
+      </w:pPr>
+      <w:rPr>
+        <w:rFonts w:ascii="Wingdings" w:hAnsi="Wingdings" w:hint="default"/>
+      </w:rPr>
+    </w:lvl>
+  </w:abstractNum>
+  <w:abstractNum w:abstractNumId="10" w15:restartNumberingAfterBreak="0">
     <w:nsid w:val="7D0C1B9C"/>
     <w:multiLevelType w:val="multilevel"/>
     <w:tmpl w:val="040C0027"/>
     <w:lvl w:ilvl="0">
       <w:start w:val="1"/>
       <w:numFmt w:val="upperRoman"/>
-      <w:pStyle w:val="Titre1"/>
+      <w:pStyle w:val="Heading1"/>
       <w:lvlText w:val="%1."/>
       <w:lvlJc w:val="left"/>
       <w:pPr>
@@ -3962,7 +5348,7 @@
     <w:lvl w:ilvl="1">
       <w:start w:val="1"/>
       <w:numFmt w:val="upperLetter"/>
-      <w:pStyle w:val="Titre2"/>
+      <w:pStyle w:val="Heading2"/>
       <w:lvlText w:val="%2."/>
       <w:lvlJc w:val="left"/>
       <w:pPr>
@@ -3972,7 +5358,7 @@
     <w:lvl w:ilvl="2">
       <w:start w:val="1"/>
       <w:numFmt w:val="decimal"/>
-      <w:pStyle w:val="Titre3"/>
+      <w:pStyle w:val="Heading3"/>
       <w:lvlText w:val="%3."/>
       <w:lvlJc w:val="left"/>
       <w:pPr>
@@ -3982,7 +5368,7 @@
     <w:lvl w:ilvl="3">
       <w:start w:val="1"/>
       <w:numFmt w:val="lowerLetter"/>
-      <w:pStyle w:val="Titre4"/>
+      <w:pStyle w:val="Heading4"/>
       <w:lvlText w:val="%4)"/>
       <w:lvlJc w:val="left"/>
       <w:pPr>
@@ -3992,7 +5378,7 @@
     <w:lvl w:ilvl="4">
       <w:start w:val="1"/>
       <w:numFmt w:val="decimal"/>
-      <w:pStyle w:val="Titre5"/>
+      <w:pStyle w:val="Heading5"/>
       <w:lvlText w:val="(%5)"/>
       <w:lvlJc w:val="left"/>
       <w:pPr>
@@ -4002,7 +5388,7 @@
     <w:lvl w:ilvl="5">
       <w:start w:val="1"/>
       <w:numFmt w:val="lowerLetter"/>
-      <w:pStyle w:val="Titre6"/>
+      <w:pStyle w:val="Heading6"/>
       <w:lvlText w:val="(%6)"/>
       <w:lvlJc w:val="left"/>
       <w:pPr>
@@ -4012,7 +5398,7 @@
     <w:lvl w:ilvl="6">
       <w:start w:val="1"/>
       <w:numFmt w:val="lowerRoman"/>
-      <w:pStyle w:val="Titre7"/>
+      <w:pStyle w:val="Heading7"/>
       <w:lvlText w:val="(%7)"/>
       <w:lvlJc w:val="left"/>
       <w:pPr>
@@ -4022,7 +5408,7 @@
     <w:lvl w:ilvl="7">
       <w:start w:val="1"/>
       <w:numFmt w:val="lowerLetter"/>
-      <w:pStyle w:val="Titre8"/>
+      <w:pStyle w:val="Heading8"/>
       <w:lvlText w:val="(%8)"/>
       <w:lvlJc w:val="left"/>
       <w:pPr>
@@ -4032,25 +5418,161 @@
     <w:lvl w:ilvl="8">
       <w:start w:val="1"/>
       <w:numFmt w:val="lowerRoman"/>
-      <w:pStyle w:val="Titre9"/>
+      <w:pStyle w:val="Heading9"/>
       <w:lvlText w:val="(%9)"/>
       <w:lvlJc w:val="left"/>
       <w:pPr>
         <w:ind w:left="5760" w:firstLine="0"/>
       </w:pPr>
+    </w:lvl>
+  </w:abstractNum>
+  <w:abstractNum w:abstractNumId="11" w15:restartNumberingAfterBreak="0">
+    <w:nsid w:val="7F7742FE"/>
+    <w:multiLevelType w:val="hybridMultilevel"/>
+    <w:tmpl w:val="A37A2CF2"/>
+    <w:lvl w:ilvl="0" w:tplc="540CE48C">
+      <w:numFmt w:val="bullet"/>
+      <w:lvlText w:val=""/>
+      <w:lvlJc w:val="left"/>
+      <w:pPr>
+        <w:ind w:left="1440" w:hanging="360"/>
+      </w:pPr>
+      <w:rPr>
+        <w:rFonts w:ascii="Aptos" w:eastAsiaTheme="minorHAnsi" w:hAnsi="Aptos" w:cstheme="minorBidi" w:hint="default"/>
+      </w:rPr>
+    </w:lvl>
+    <w:lvl w:ilvl="1" w:tplc="040C0003" w:tentative="1">
+      <w:start w:val="1"/>
+      <w:numFmt w:val="bullet"/>
+      <w:lvlText w:val="o"/>
+      <w:lvlJc w:val="left"/>
+      <w:pPr>
+        <w:ind w:left="2160" w:hanging="360"/>
+      </w:pPr>
+      <w:rPr>
+        <w:rFonts w:ascii="Courier New" w:hAnsi="Courier New" w:cs="Courier New" w:hint="default"/>
+      </w:rPr>
+    </w:lvl>
+    <w:lvl w:ilvl="2" w:tplc="040C0005" w:tentative="1">
+      <w:start w:val="1"/>
+      <w:numFmt w:val="bullet"/>
+      <w:lvlText w:val=""/>
+      <w:lvlJc w:val="left"/>
+      <w:pPr>
+        <w:ind w:left="2880" w:hanging="360"/>
+      </w:pPr>
+      <w:rPr>
+        <w:rFonts w:ascii="Wingdings" w:hAnsi="Wingdings" w:hint="default"/>
+      </w:rPr>
+    </w:lvl>
+    <w:lvl w:ilvl="3" w:tplc="040C0001" w:tentative="1">
+      <w:start w:val="1"/>
+      <w:numFmt w:val="bullet"/>
+      <w:lvlText w:val=""/>
+      <w:lvlJc w:val="left"/>
+      <w:pPr>
+        <w:ind w:left="3600" w:hanging="360"/>
+      </w:pPr>
+      <w:rPr>
+        <w:rFonts w:ascii="Symbol" w:hAnsi="Symbol" w:hint="default"/>
+      </w:rPr>
+    </w:lvl>
+    <w:lvl w:ilvl="4" w:tplc="040C0003" w:tentative="1">
+      <w:start w:val="1"/>
+      <w:numFmt w:val="bullet"/>
+      <w:lvlText w:val="o"/>
+      <w:lvlJc w:val="left"/>
+      <w:pPr>
+        <w:ind w:left="4320" w:hanging="360"/>
+      </w:pPr>
+      <w:rPr>
+        <w:rFonts w:ascii="Courier New" w:hAnsi="Courier New" w:cs="Courier New" w:hint="default"/>
+      </w:rPr>
+    </w:lvl>
+    <w:lvl w:ilvl="5" w:tplc="040C0005" w:tentative="1">
+      <w:start w:val="1"/>
+      <w:numFmt w:val="bullet"/>
+      <w:lvlText w:val=""/>
+      <w:lvlJc w:val="left"/>
+      <w:pPr>
+        <w:ind w:left="5040" w:hanging="360"/>
+      </w:pPr>
+      <w:rPr>
+        <w:rFonts w:ascii="Wingdings" w:hAnsi="Wingdings" w:hint="default"/>
+      </w:rPr>
+    </w:lvl>
+    <w:lvl w:ilvl="6" w:tplc="040C0001" w:tentative="1">
+      <w:start w:val="1"/>
+      <w:numFmt w:val="bullet"/>
+      <w:lvlText w:val=""/>
+      <w:lvlJc w:val="left"/>
+      <w:pPr>
+        <w:ind w:left="5760" w:hanging="360"/>
+      </w:pPr>
+      <w:rPr>
+        <w:rFonts w:ascii="Symbol" w:hAnsi="Symbol" w:hint="default"/>
+      </w:rPr>
+    </w:lvl>
+    <w:lvl w:ilvl="7" w:tplc="040C0003" w:tentative="1">
+      <w:start w:val="1"/>
+      <w:numFmt w:val="bullet"/>
+      <w:lvlText w:val="o"/>
+      <w:lvlJc w:val="left"/>
+      <w:pPr>
+        <w:ind w:left="6480" w:hanging="360"/>
+      </w:pPr>
+      <w:rPr>
+        <w:rFonts w:ascii="Courier New" w:hAnsi="Courier New" w:cs="Courier New" w:hint="default"/>
+      </w:rPr>
+    </w:lvl>
+    <w:lvl w:ilvl="8" w:tplc="040C0005" w:tentative="1">
+      <w:start w:val="1"/>
+      <w:numFmt w:val="bullet"/>
+      <w:lvlText w:val=""/>
+      <w:lvlJc w:val="left"/>
+      <w:pPr>
+        <w:ind w:left="7200" w:hanging="360"/>
+      </w:pPr>
+      <w:rPr>
+        <w:rFonts w:ascii="Wingdings" w:hAnsi="Wingdings" w:hint="default"/>
+      </w:rPr>
     </w:lvl>
   </w:abstractNum>
   <w:num w:numId="1" w16cid:durableId="302001250">
+    <w:abstractNumId w:val="6"/>
+  </w:num>
+  <w:num w:numId="2" w16cid:durableId="1292440670">
+    <w:abstractNumId w:val="10"/>
+  </w:num>
+  <w:num w:numId="3" w16cid:durableId="553199720">
     <w:abstractNumId w:val="2"/>
   </w:num>
-  <w:num w:numId="2" w16cid:durableId="1292440670">
+  <w:num w:numId="4" w16cid:durableId="693655936">
     <w:abstractNumId w:val="3"/>
   </w:num>
-  <w:num w:numId="3" w16cid:durableId="553199720">
+  <w:num w:numId="5" w16cid:durableId="1259362906">
+    <w:abstractNumId w:val="9"/>
+  </w:num>
+  <w:num w:numId="6" w16cid:durableId="904416848">
+    <w:abstractNumId w:val="7"/>
+  </w:num>
+  <w:num w:numId="7" w16cid:durableId="835145976">
+    <w:abstractNumId w:val="11"/>
+  </w:num>
+  <w:num w:numId="8" w16cid:durableId="1811047531">
+    <w:abstractNumId w:val="1"/>
+  </w:num>
+  <w:num w:numId="9" w16cid:durableId="1312904533">
+    <w:abstractNumId w:val="4"/>
+  </w:num>
+  <w:num w:numId="10" w16cid:durableId="885288818">
+    <w:abstractNumId w:val="5"/>
+  </w:num>
+  <w:num w:numId="11" w16cid:durableId="1346861470">
+    <w:abstractNumId w:val="8"/>
+  </w:num>
+  <w:num w:numId="12" w16cid:durableId="1959023568">
     <w:abstractNumId w:val="0"/>
-  </w:num>
-  <w:num w:numId="4" w16cid:durableId="693655936">
-    <w:abstractNumId w:val="1"/>
   </w:num>
 </w:numbering>
 </file>
@@ -4453,11 +5975,11 @@
     <w:qFormat/>
     <w:rsid w:val="00D833E5"/>
   </w:style>
-  <w:style w:type="paragraph" w:styleId="Titre1">
+  <w:style w:type="paragraph" w:styleId="Heading1">
     <w:name w:val="heading 1"/>
     <w:basedOn w:val="Normal"/>
     <w:next w:val="Normal"/>
-    <w:link w:val="Titre1Car"/>
+    <w:link w:val="Heading1Char"/>
     <w:uiPriority w:val="9"/>
     <w:qFormat/>
     <w:rsid w:val="00D833E5"/>
@@ -4477,11 +5999,11 @@
       <w:szCs w:val="40"/>
     </w:rPr>
   </w:style>
-  <w:style w:type="paragraph" w:styleId="Titre2">
+  <w:style w:type="paragraph" w:styleId="Heading2">
     <w:name w:val="heading 2"/>
     <w:basedOn w:val="Normal"/>
     <w:next w:val="Normal"/>
-    <w:link w:val="Titre2Car"/>
+    <w:link w:val="Heading2Char"/>
     <w:uiPriority w:val="9"/>
     <w:unhideWhenUsed/>
     <w:qFormat/>
@@ -4503,11 +6025,11 @@
       <w:szCs w:val="32"/>
     </w:rPr>
   </w:style>
-  <w:style w:type="paragraph" w:styleId="Titre3">
+  <w:style w:type="paragraph" w:styleId="Heading3">
     <w:name w:val="heading 3"/>
     <w:basedOn w:val="Normal"/>
     <w:next w:val="Normal"/>
-    <w:link w:val="Titre3Car"/>
+    <w:link w:val="Heading3Char"/>
     <w:uiPriority w:val="9"/>
     <w:semiHidden/>
     <w:unhideWhenUsed/>
@@ -4530,11 +6052,11 @@
       <w:szCs w:val="28"/>
     </w:rPr>
   </w:style>
-  <w:style w:type="paragraph" w:styleId="Titre4">
+  <w:style w:type="paragraph" w:styleId="Heading4">
     <w:name w:val="heading 4"/>
     <w:basedOn w:val="Normal"/>
     <w:next w:val="Normal"/>
-    <w:link w:val="Titre4Car"/>
+    <w:link w:val="Heading4Char"/>
     <w:uiPriority w:val="9"/>
     <w:semiHidden/>
     <w:unhideWhenUsed/>
@@ -4557,11 +6079,11 @@
       <w:color w:val="0F4761" w:themeColor="accent1" w:themeShade="BF"/>
     </w:rPr>
   </w:style>
-  <w:style w:type="paragraph" w:styleId="Titre5">
+  <w:style w:type="paragraph" w:styleId="Heading5">
     <w:name w:val="heading 5"/>
     <w:basedOn w:val="Normal"/>
     <w:next w:val="Normal"/>
-    <w:link w:val="Titre5Car"/>
+    <w:link w:val="Heading5Char"/>
     <w:uiPriority w:val="9"/>
     <w:semiHidden/>
     <w:unhideWhenUsed/>
@@ -4582,11 +6104,11 @@
       <w:color w:val="0F4761" w:themeColor="accent1" w:themeShade="BF"/>
     </w:rPr>
   </w:style>
-  <w:style w:type="paragraph" w:styleId="Titre6">
+  <w:style w:type="paragraph" w:styleId="Heading6">
     <w:name w:val="heading 6"/>
     <w:basedOn w:val="Normal"/>
     <w:next w:val="Normal"/>
-    <w:link w:val="Titre6Car"/>
+    <w:link w:val="Heading6Char"/>
     <w:uiPriority w:val="9"/>
     <w:semiHidden/>
     <w:unhideWhenUsed/>
@@ -4609,11 +6131,11 @@
       <w:color w:val="595959" w:themeColor="text1" w:themeTint="A6"/>
     </w:rPr>
   </w:style>
-  <w:style w:type="paragraph" w:styleId="Titre7">
+  <w:style w:type="paragraph" w:styleId="Heading7">
     <w:name w:val="heading 7"/>
     <w:basedOn w:val="Normal"/>
     <w:next w:val="Normal"/>
-    <w:link w:val="Titre7Car"/>
+    <w:link w:val="Heading7Char"/>
     <w:uiPriority w:val="9"/>
     <w:semiHidden/>
     <w:unhideWhenUsed/>
@@ -4634,11 +6156,11 @@
       <w:color w:val="595959" w:themeColor="text1" w:themeTint="A6"/>
     </w:rPr>
   </w:style>
-  <w:style w:type="paragraph" w:styleId="Titre8">
+  <w:style w:type="paragraph" w:styleId="Heading8">
     <w:name w:val="heading 8"/>
     <w:basedOn w:val="Normal"/>
     <w:next w:val="Normal"/>
-    <w:link w:val="Titre8Car"/>
+    <w:link w:val="Heading8Char"/>
     <w:uiPriority w:val="9"/>
     <w:semiHidden/>
     <w:unhideWhenUsed/>
@@ -4660,11 +6182,11 @@
       <w:color w:val="272727" w:themeColor="text1" w:themeTint="D8"/>
     </w:rPr>
   </w:style>
-  <w:style w:type="paragraph" w:styleId="Titre9">
+  <w:style w:type="paragraph" w:styleId="Heading9">
     <w:name w:val="heading 9"/>
     <w:basedOn w:val="Normal"/>
     <w:next w:val="Normal"/>
-    <w:link w:val="Titre9Car"/>
+    <w:link w:val="Heading9Char"/>
     <w:uiPriority w:val="9"/>
     <w:semiHidden/>
     <w:unhideWhenUsed/>
@@ -4684,13 +6206,12 @@
       <w:color w:val="272727" w:themeColor="text1" w:themeTint="D8"/>
     </w:rPr>
   </w:style>
-  <w:style w:type="character" w:default="1" w:styleId="Policepardfaut">
+  <w:style w:type="character" w:default="1" w:styleId="DefaultParagraphFont">
     <w:name w:val="Default Paragraph Font"/>
     <w:uiPriority w:val="1"/>
-    <w:semiHidden/>
     <w:unhideWhenUsed/>
   </w:style>
-  <w:style w:type="table" w:default="1" w:styleId="TableauNormal">
+  <w:style w:type="table" w:default="1" w:styleId="TableNormal">
     <w:name w:val="Normal Table"/>
     <w:uiPriority w:val="99"/>
     <w:semiHidden/>
@@ -4705,16 +6226,16 @@
       </w:tblCellMar>
     </w:tblPr>
   </w:style>
-  <w:style w:type="numbering" w:default="1" w:styleId="Aucuneliste">
+  <w:style w:type="numbering" w:default="1" w:styleId="NoList">
     <w:name w:val="No List"/>
     <w:uiPriority w:val="99"/>
     <w:semiHidden/>
     <w:unhideWhenUsed/>
   </w:style>
-  <w:style w:type="character" w:customStyle="1" w:styleId="Titre1Car">
-    <w:name w:val="Titre 1 Car"/>
-    <w:basedOn w:val="Policepardfaut"/>
-    <w:link w:val="Titre1"/>
+  <w:style w:type="character" w:customStyle="1" w:styleId="Heading1Char">
+    <w:name w:val="Heading 1 Char"/>
+    <w:basedOn w:val="DefaultParagraphFont"/>
+    <w:link w:val="Heading1"/>
     <w:uiPriority w:val="9"/>
     <w:rsid w:val="00D833E5"/>
     <w:rPr>
@@ -4724,10 +6245,10 @@
       <w:szCs w:val="40"/>
     </w:rPr>
   </w:style>
-  <w:style w:type="character" w:customStyle="1" w:styleId="Titre2Car">
-    <w:name w:val="Titre 2 Car"/>
-    <w:basedOn w:val="Policepardfaut"/>
-    <w:link w:val="Titre2"/>
+  <w:style w:type="character" w:customStyle="1" w:styleId="Heading2Char">
+    <w:name w:val="Heading 2 Char"/>
+    <w:basedOn w:val="DefaultParagraphFont"/>
+    <w:link w:val="Heading2"/>
     <w:uiPriority w:val="9"/>
     <w:rsid w:val="00D833E5"/>
     <w:rPr>
@@ -4737,10 +6258,10 @@
       <w:szCs w:val="32"/>
     </w:rPr>
   </w:style>
-  <w:style w:type="character" w:customStyle="1" w:styleId="Titre3Car">
-    <w:name w:val="Titre 3 Car"/>
-    <w:basedOn w:val="Policepardfaut"/>
-    <w:link w:val="Titre3"/>
+  <w:style w:type="character" w:customStyle="1" w:styleId="Heading3Char">
+    <w:name w:val="Heading 3 Char"/>
+    <w:basedOn w:val="DefaultParagraphFont"/>
+    <w:link w:val="Heading3"/>
     <w:uiPriority w:val="9"/>
     <w:semiHidden/>
     <w:rsid w:val="000A2A7D"/>
@@ -4751,10 +6272,10 @@
       <w:szCs w:val="28"/>
     </w:rPr>
   </w:style>
-  <w:style w:type="character" w:customStyle="1" w:styleId="Titre4Car">
-    <w:name w:val="Titre 4 Car"/>
-    <w:basedOn w:val="Policepardfaut"/>
-    <w:link w:val="Titre4"/>
+  <w:style w:type="character" w:customStyle="1" w:styleId="Heading4Char">
+    <w:name w:val="Heading 4 Char"/>
+    <w:basedOn w:val="DefaultParagraphFont"/>
+    <w:link w:val="Heading4"/>
     <w:uiPriority w:val="9"/>
     <w:semiHidden/>
     <w:rsid w:val="000A2A7D"/>
@@ -4765,10 +6286,10 @@
       <w:color w:val="0F4761" w:themeColor="accent1" w:themeShade="BF"/>
     </w:rPr>
   </w:style>
-  <w:style w:type="character" w:customStyle="1" w:styleId="Titre5Car">
-    <w:name w:val="Titre 5 Car"/>
-    <w:basedOn w:val="Policepardfaut"/>
-    <w:link w:val="Titre5"/>
+  <w:style w:type="character" w:customStyle="1" w:styleId="Heading5Char">
+    <w:name w:val="Heading 5 Char"/>
+    <w:basedOn w:val="DefaultParagraphFont"/>
+    <w:link w:val="Heading5"/>
     <w:uiPriority w:val="9"/>
     <w:semiHidden/>
     <w:rsid w:val="000A2A7D"/>
@@ -4777,10 +6298,10 @@
       <w:color w:val="0F4761" w:themeColor="accent1" w:themeShade="BF"/>
     </w:rPr>
   </w:style>
-  <w:style w:type="character" w:customStyle="1" w:styleId="Titre6Car">
-    <w:name w:val="Titre 6 Car"/>
-    <w:basedOn w:val="Policepardfaut"/>
-    <w:link w:val="Titre6"/>
+  <w:style w:type="character" w:customStyle="1" w:styleId="Heading6Char">
+    <w:name w:val="Heading 6 Char"/>
+    <w:basedOn w:val="DefaultParagraphFont"/>
+    <w:link w:val="Heading6"/>
     <w:uiPriority w:val="9"/>
     <w:semiHidden/>
     <w:rsid w:val="000A2A7D"/>
@@ -4791,10 +6312,10 @@
       <w:color w:val="595959" w:themeColor="text1" w:themeTint="A6"/>
     </w:rPr>
   </w:style>
-  <w:style w:type="character" w:customStyle="1" w:styleId="Titre7Car">
-    <w:name w:val="Titre 7 Car"/>
-    <w:basedOn w:val="Policepardfaut"/>
-    <w:link w:val="Titre7"/>
+  <w:style w:type="character" w:customStyle="1" w:styleId="Heading7Char">
+    <w:name w:val="Heading 7 Char"/>
+    <w:basedOn w:val="DefaultParagraphFont"/>
+    <w:link w:val="Heading7"/>
     <w:uiPriority w:val="9"/>
     <w:semiHidden/>
     <w:rsid w:val="000A2A7D"/>
@@ -4803,10 +6324,10 @@
       <w:color w:val="595959" w:themeColor="text1" w:themeTint="A6"/>
     </w:rPr>
   </w:style>
-  <w:style w:type="character" w:customStyle="1" w:styleId="Titre8Car">
-    <w:name w:val="Titre 8 Car"/>
-    <w:basedOn w:val="Policepardfaut"/>
-    <w:link w:val="Titre8"/>
+  <w:style w:type="character" w:customStyle="1" w:styleId="Heading8Char">
+    <w:name w:val="Heading 8 Char"/>
+    <w:basedOn w:val="DefaultParagraphFont"/>
+    <w:link w:val="Heading8"/>
     <w:uiPriority w:val="9"/>
     <w:semiHidden/>
     <w:rsid w:val="000A2A7D"/>
@@ -4817,10 +6338,10 @@
       <w:color w:val="272727" w:themeColor="text1" w:themeTint="D8"/>
     </w:rPr>
   </w:style>
-  <w:style w:type="character" w:customStyle="1" w:styleId="Titre9Car">
-    <w:name w:val="Titre 9 Car"/>
-    <w:basedOn w:val="Policepardfaut"/>
-    <w:link w:val="Titre9"/>
+  <w:style w:type="character" w:customStyle="1" w:styleId="Heading9Char">
+    <w:name w:val="Heading 9 Char"/>
+    <w:basedOn w:val="DefaultParagraphFont"/>
+    <w:link w:val="Heading9"/>
     <w:uiPriority w:val="9"/>
     <w:semiHidden/>
     <w:rsid w:val="000A2A7D"/>
@@ -4829,11 +6350,11 @@
       <w:color w:val="272727" w:themeColor="text1" w:themeTint="D8"/>
     </w:rPr>
   </w:style>
-  <w:style w:type="paragraph" w:styleId="Titre">
+  <w:style w:type="paragraph" w:styleId="Title">
     <w:name w:val="Title"/>
     <w:basedOn w:val="Normal"/>
     <w:next w:val="Normal"/>
-    <w:link w:val="TitreCar"/>
+    <w:link w:val="TitleChar"/>
     <w:uiPriority w:val="10"/>
     <w:qFormat/>
     <w:rsid w:val="000A2A7D"/>
@@ -4849,10 +6370,10 @@
       <w:szCs w:val="56"/>
     </w:rPr>
   </w:style>
-  <w:style w:type="character" w:customStyle="1" w:styleId="TitreCar">
-    <w:name w:val="Titre Car"/>
-    <w:basedOn w:val="Policepardfaut"/>
-    <w:link w:val="Titre"/>
+  <w:style w:type="character" w:customStyle="1" w:styleId="TitleChar">
+    <w:name w:val="Title Char"/>
+    <w:basedOn w:val="DefaultParagraphFont"/>
+    <w:link w:val="Title"/>
     <w:uiPriority w:val="10"/>
     <w:rsid w:val="000A2A7D"/>
     <w:rPr>
@@ -4863,11 +6384,11 @@
       <w:szCs w:val="56"/>
     </w:rPr>
   </w:style>
-  <w:style w:type="paragraph" w:styleId="Sous-titre">
+  <w:style w:type="paragraph" w:styleId="Subtitle">
     <w:name w:val="Subtitle"/>
     <w:basedOn w:val="Normal"/>
     <w:next w:val="Normal"/>
-    <w:link w:val="Sous-titreCar"/>
+    <w:link w:val="SubtitleChar"/>
     <w:uiPriority w:val="11"/>
     <w:qFormat/>
     <w:rsid w:val="000A2A7D"/>
@@ -4884,10 +6405,10 @@
       <w:szCs w:val="28"/>
     </w:rPr>
   </w:style>
-  <w:style w:type="character" w:customStyle="1" w:styleId="Sous-titreCar">
-    <w:name w:val="Sous-titre Car"/>
-    <w:basedOn w:val="Policepardfaut"/>
-    <w:link w:val="Sous-titre"/>
+  <w:style w:type="character" w:customStyle="1" w:styleId="SubtitleChar">
+    <w:name w:val="Subtitle Char"/>
+    <w:basedOn w:val="DefaultParagraphFont"/>
+    <w:link w:val="Subtitle"/>
     <w:uiPriority w:val="11"/>
     <w:rsid w:val="000A2A7D"/>
     <w:rPr>
@@ -4898,11 +6419,11 @@
       <w:szCs w:val="28"/>
     </w:rPr>
   </w:style>
-  <w:style w:type="paragraph" w:styleId="Citation">
+  <w:style w:type="paragraph" w:styleId="Quote">
     <w:name w:val="Quote"/>
     <w:basedOn w:val="Normal"/>
     <w:next w:val="Normal"/>
-    <w:link w:val="CitationCar"/>
+    <w:link w:val="QuoteChar"/>
     <w:uiPriority w:val="29"/>
     <w:qFormat/>
     <w:rsid w:val="000A2A7D"/>
@@ -4916,10 +6437,10 @@
       <w:color w:val="404040" w:themeColor="text1" w:themeTint="BF"/>
     </w:rPr>
   </w:style>
-  <w:style w:type="character" w:customStyle="1" w:styleId="CitationCar">
-    <w:name w:val="Citation Car"/>
-    <w:basedOn w:val="Policepardfaut"/>
-    <w:link w:val="Citation"/>
+  <w:style w:type="character" w:customStyle="1" w:styleId="QuoteChar">
+    <w:name w:val="Quote Char"/>
+    <w:basedOn w:val="DefaultParagraphFont"/>
+    <w:link w:val="Quote"/>
     <w:uiPriority w:val="29"/>
     <w:rsid w:val="000A2A7D"/>
     <w:rPr>
@@ -4928,7 +6449,7 @@
       <w:color w:val="404040" w:themeColor="text1" w:themeTint="BF"/>
     </w:rPr>
   </w:style>
-  <w:style w:type="paragraph" w:styleId="Paragraphedeliste">
+  <w:style w:type="paragraph" w:styleId="ListParagraph">
     <w:name w:val="List Paragraph"/>
     <w:basedOn w:val="Normal"/>
     <w:uiPriority w:val="34"/>
@@ -4939,9 +6460,9 @@
       <w:contextualSpacing/>
     </w:pPr>
   </w:style>
-  <w:style w:type="character" w:styleId="Accentuationintense">
+  <w:style w:type="character" w:styleId="IntenseEmphasis">
     <w:name w:val="Intense Emphasis"/>
-    <w:basedOn w:val="Policepardfaut"/>
+    <w:basedOn w:val="DefaultParagraphFont"/>
     <w:uiPriority w:val="21"/>
     <w:qFormat/>
     <w:rsid w:val="000A2A7D"/>
@@ -4951,11 +6472,11 @@
       <w:color w:val="0F4761" w:themeColor="accent1" w:themeShade="BF"/>
     </w:rPr>
   </w:style>
-  <w:style w:type="paragraph" w:styleId="Citationintense">
+  <w:style w:type="paragraph" w:styleId="IntenseQuote">
     <w:name w:val="Intense Quote"/>
     <w:basedOn w:val="Normal"/>
     <w:next w:val="Normal"/>
-    <w:link w:val="CitationintenseCar"/>
+    <w:link w:val="IntenseQuoteChar"/>
     <w:uiPriority w:val="30"/>
     <w:qFormat/>
     <w:rsid w:val="000A2A7D"/>
@@ -4974,10 +6495,10 @@
       <w:color w:val="0F4761" w:themeColor="accent1" w:themeShade="BF"/>
     </w:rPr>
   </w:style>
-  <w:style w:type="character" w:customStyle="1" w:styleId="CitationintenseCar">
-    <w:name w:val="Citation intense Car"/>
-    <w:basedOn w:val="Policepardfaut"/>
-    <w:link w:val="Citationintense"/>
+  <w:style w:type="character" w:customStyle="1" w:styleId="IntenseQuoteChar">
+    <w:name w:val="Intense Quote Char"/>
+    <w:basedOn w:val="DefaultParagraphFont"/>
+    <w:link w:val="IntenseQuote"/>
     <w:uiPriority w:val="30"/>
     <w:rsid w:val="000A2A7D"/>
     <w:rPr>
@@ -4986,9 +6507,9 @@
       <w:color w:val="0F4761" w:themeColor="accent1" w:themeShade="BF"/>
     </w:rPr>
   </w:style>
-  <w:style w:type="character" w:styleId="Rfrenceintense">
+  <w:style w:type="character" w:styleId="IntenseReference">
     <w:name w:val="Intense Reference"/>
-    <w:basedOn w:val="Policepardfaut"/>
+    <w:basedOn w:val="DefaultParagraphFont"/>
     <w:uiPriority w:val="32"/>
     <w:qFormat/>
     <w:rsid w:val="000A2A7D"/>
@@ -5017,9 +6538,9 @@
       <w14:ligatures w14:val="none"/>
     </w:rPr>
   </w:style>
-  <w:style w:type="character" w:styleId="lev">
+  <w:style w:type="character" w:styleId="Strong">
     <w:name w:val="Strong"/>
-    <w:basedOn w:val="Policepardfaut"/>
+    <w:basedOn w:val="DefaultParagraphFont"/>
     <w:uiPriority w:val="22"/>
     <w:qFormat/>
     <w:rsid w:val="000A2A7D"/>
@@ -5028,9 +6549,9 @@
       <w:bCs/>
     </w:rPr>
   </w:style>
-  <w:style w:type="table" w:styleId="Grilledutableau">
+  <w:style w:type="table" w:styleId="TableGrid">
     <w:name w:val="Table Grid"/>
-    <w:basedOn w:val="TableauNormal"/>
+    <w:basedOn w:val="TableNormal"/>
     <w:uiPriority w:val="39"/>
     <w:rsid w:val="00F70FB2"/>
     <w:tblPr>
@@ -5044,9 +6565,9 @@
       </w:tblBorders>
     </w:tblPr>
   </w:style>
-  <w:style w:type="table" w:styleId="TableauGrille5Fonc">
+  <w:style w:type="table" w:styleId="GridTable5Dark">
     <w:name w:val="Grid Table 5 Dark"/>
-    <w:basedOn w:val="TableauNormal"/>
+    <w:basedOn w:val="TableNormal"/>
     <w:uiPriority w:val="50"/>
     <w:rsid w:val="00F70FB2"/>
     <w:tblPr>
@@ -5147,9 +6668,9 @@
       </w:tcPr>
     </w:tblStylePr>
   </w:style>
-  <w:style w:type="table" w:styleId="TableauGrille3">
+  <w:style w:type="table" w:styleId="GridTable3">
     <w:name w:val="Grid Table 3"/>
-    <w:basedOn w:val="TableauNormal"/>
+    <w:basedOn w:val="TableNormal"/>
     <w:uiPriority w:val="48"/>
     <w:rsid w:val="00F70FB2"/>
     <w:tblPr>
@@ -5280,10 +6801,10 @@
       </w:tcPr>
     </w:tblStylePr>
   </w:style>
-  <w:style w:type="paragraph" w:styleId="En-tte">
+  <w:style w:type="paragraph" w:styleId="Header">
     <w:name w:val="header"/>
     <w:basedOn w:val="Normal"/>
-    <w:link w:val="En-tteCar"/>
+    <w:link w:val="HeaderChar"/>
     <w:uiPriority w:val="99"/>
     <w:unhideWhenUsed/>
     <w:rsid w:val="00F07692"/>
@@ -5294,17 +6815,17 @@
       </w:tabs>
     </w:pPr>
   </w:style>
-  <w:style w:type="character" w:customStyle="1" w:styleId="En-tteCar">
-    <w:name w:val="En-tête Car"/>
-    <w:basedOn w:val="Policepardfaut"/>
-    <w:link w:val="En-tte"/>
+  <w:style w:type="character" w:customStyle="1" w:styleId="HeaderChar">
+    <w:name w:val="Header Char"/>
+    <w:basedOn w:val="DefaultParagraphFont"/>
+    <w:link w:val="Header"/>
     <w:uiPriority w:val="99"/>
     <w:rsid w:val="00F07692"/>
   </w:style>
-  <w:style w:type="paragraph" w:styleId="Pieddepage">
+  <w:style w:type="paragraph" w:styleId="Footer">
     <w:name w:val="footer"/>
     <w:basedOn w:val="Normal"/>
-    <w:link w:val="PieddepageCar"/>
+    <w:link w:val="FooterChar"/>
     <w:uiPriority w:val="99"/>
     <w:unhideWhenUsed/>
     <w:rsid w:val="00F07692"/>
@@ -5315,16 +6836,16 @@
       </w:tabs>
     </w:pPr>
   </w:style>
-  <w:style w:type="character" w:customStyle="1" w:styleId="PieddepageCar">
-    <w:name w:val="Pied de page Car"/>
-    <w:basedOn w:val="Policepardfaut"/>
-    <w:link w:val="Pieddepage"/>
+  <w:style w:type="character" w:customStyle="1" w:styleId="FooterChar">
+    <w:name w:val="Footer Char"/>
+    <w:basedOn w:val="DefaultParagraphFont"/>
+    <w:link w:val="Footer"/>
     <w:uiPriority w:val="99"/>
     <w:rsid w:val="00F07692"/>
   </w:style>
-  <w:style w:type="paragraph" w:styleId="En-ttedetabledesmatires">
+  <w:style w:type="paragraph" w:styleId="TOCHeading">
     <w:name w:val="TOC Heading"/>
-    <w:basedOn w:val="Titre1"/>
+    <w:basedOn w:val="Heading1"/>
     <w:next w:val="Normal"/>
     <w:uiPriority w:val="39"/>
     <w:unhideWhenUsed/>
@@ -5347,7 +6868,7 @@
       <w14:ligatures w14:val="none"/>
     </w:rPr>
   </w:style>
-  <w:style w:type="paragraph" w:styleId="TM1">
+  <w:style w:type="paragraph" w:styleId="TOC1">
     <w:name w:val="toc 1"/>
     <w:basedOn w:val="Normal"/>
     <w:next w:val="Normal"/>
@@ -5365,7 +6886,7 @@
       <w:iCs/>
     </w:rPr>
   </w:style>
-  <w:style w:type="paragraph" w:styleId="TM2">
+  <w:style w:type="paragraph" w:styleId="TOC2">
     <w:name w:val="toc 2"/>
     <w:basedOn w:val="Normal"/>
     <w:next w:val="Normal"/>
@@ -5384,9 +6905,9 @@
       <w:szCs w:val="22"/>
     </w:rPr>
   </w:style>
-  <w:style w:type="character" w:styleId="Lienhypertexte">
+  <w:style w:type="character" w:styleId="Hyperlink">
     <w:name w:val="Hyperlink"/>
-    <w:basedOn w:val="Policepardfaut"/>
+    <w:basedOn w:val="DefaultParagraphFont"/>
     <w:uiPriority w:val="99"/>
     <w:unhideWhenUsed/>
     <w:rsid w:val="00DE7F55"/>
@@ -5395,7 +6916,7 @@
       <w:u w:val="single"/>
     </w:rPr>
   </w:style>
-  <w:style w:type="paragraph" w:styleId="TM3">
+  <w:style w:type="paragraph" w:styleId="TOC3">
     <w:name w:val="toc 3"/>
     <w:basedOn w:val="Normal"/>
     <w:next w:val="Normal"/>
@@ -5412,7 +6933,7 @@
       <w:szCs w:val="20"/>
     </w:rPr>
   </w:style>
-  <w:style w:type="paragraph" w:styleId="TM4">
+  <w:style w:type="paragraph" w:styleId="TOC4">
     <w:name w:val="toc 4"/>
     <w:basedOn w:val="Normal"/>
     <w:next w:val="Normal"/>
@@ -5429,7 +6950,7 @@
       <w:szCs w:val="20"/>
     </w:rPr>
   </w:style>
-  <w:style w:type="paragraph" w:styleId="TM5">
+  <w:style w:type="paragraph" w:styleId="TOC5">
     <w:name w:val="toc 5"/>
     <w:basedOn w:val="Normal"/>
     <w:next w:val="Normal"/>
@@ -5446,7 +6967,7 @@
       <w:szCs w:val="20"/>
     </w:rPr>
   </w:style>
-  <w:style w:type="paragraph" w:styleId="TM6">
+  <w:style w:type="paragraph" w:styleId="TOC6">
     <w:name w:val="toc 6"/>
     <w:basedOn w:val="Normal"/>
     <w:next w:val="Normal"/>
@@ -5463,7 +6984,7 @@
       <w:szCs w:val="20"/>
     </w:rPr>
   </w:style>
-  <w:style w:type="paragraph" w:styleId="TM7">
+  <w:style w:type="paragraph" w:styleId="TOC7">
     <w:name w:val="toc 7"/>
     <w:basedOn w:val="Normal"/>
     <w:next w:val="Normal"/>
@@ -5480,7 +7001,7 @@
       <w:szCs w:val="20"/>
     </w:rPr>
   </w:style>
-  <w:style w:type="paragraph" w:styleId="TM8">
+  <w:style w:type="paragraph" w:styleId="TOC8">
     <w:name w:val="toc 8"/>
     <w:basedOn w:val="Normal"/>
     <w:next w:val="Normal"/>
@@ -5497,7 +7018,7 @@
       <w:szCs w:val="20"/>
     </w:rPr>
   </w:style>
-  <w:style w:type="paragraph" w:styleId="TM9">
+  <w:style w:type="paragraph" w:styleId="TOC9">
     <w:name w:val="toc 9"/>
     <w:basedOn w:val="Normal"/>
     <w:next w:val="Normal"/>

</xml_diff>